<commit_message>
docs: set execution capability and domain model status
</commit_message>
<xml_diff>
--- a/docs/IT-034-001 — Execution Domain Model MVP.docx
+++ b/docs/IT-034-001 — Execution Domain Model MVP.docx
@@ -30,47 +30,6 @@
     </w:p>
     <w:p>
       <w:pPr>
-        <w:pStyle w:val="Heading2"/>
-        <w:keepNext w:val="0"/>
-        <w:keepLines w:val="0"/>
-        <w:spacing w:after="80" w:lineRule="auto"/>
-        <w:rPr>
-          <w:b w:val="1"/>
-          <w:bCs w:val="1"/>
-          <w:sz w:val="34"/>
-          <w:szCs w:val="34"/>
-        </w:rPr>
-      </w:pPr>
-      <w:bookmarkStart w:colFirst="0" w:colLast="0" w:name="_mytog66eltw8" w:id="1"/>
-      <w:bookmarkEnd w:id="1"/>
-      <w:r>
-        <w:rPr>
-          <w:b w:val="1"/>
-          <w:bCs w:val="1"/>
-          <w:sz w:val="34"/>
-          <w:szCs w:val="34"/>
-          <w:rtl w:val="0"/>
-        </w:rPr>
-        <w:t xml:space="preserve">Entrega 1 — Identidad del Modelo de Dominio</w:t>
-      </w:r>
-    </w:p>
-    <w:p>
-      <w:pPr>
-        <w:rPr/>
-      </w:pPr>
-      <w:r>
-        <w:pict>
-          <v:rect style="width:0.0pt;height:1.5pt" o:hr="t" o:hrstd="t" o:hralign="center" fillcolor="#A0A0A0" stroked="f"/>
-        </w:pict>
-      </w:r>
-      <w:r>
-        <w:rPr>
-          <w:rtl w:val="0"/>
-        </w:rPr>
-      </w:r>
-    </w:p>
-    <w:p>
-      <w:pPr>
         <w:pStyle w:val="Heading1"/>
         <w:keepNext w:val="0"/>
         <w:keepLines w:val="0"/>
@@ -82,8 +41,8 @@
           <w:szCs w:val="46"/>
         </w:rPr>
       </w:pPr>
-      <w:bookmarkStart w:colFirst="0" w:colLast="0" w:name="_quigwywhcn3u" w:id="2"/>
-      <w:bookmarkEnd w:id="2"/>
+      <w:bookmarkStart w:colFirst="0" w:colLast="0" w:name="_quigwywhcn3u" w:id="1"/>
+      <w:bookmarkEnd w:id="1"/>
       <w:r>
         <w:rPr>
           <w:b w:val="1"/>
@@ -475,7 +434,7 @@
               <w:rPr>
                 <w:rtl w:val="0"/>
               </w:rPr>
-              <w:t xml:space="preserve">Draft</w:t>
+              <w:t xml:space="preserve">Approved </w:t>
             </w:r>
           </w:p>
         </w:tc>
@@ -719,8 +678,8 @@
           <w:szCs w:val="46"/>
         </w:rPr>
       </w:pPr>
-      <w:bookmarkStart w:colFirst="0" w:colLast="0" w:name="_bt7xngmwudhx" w:id="3"/>
-      <w:bookmarkEnd w:id="3"/>
+      <w:bookmarkStart w:colFirst="0" w:colLast="0" w:name="_bt7xngmwudhx" w:id="2"/>
+      <w:bookmarkEnd w:id="2"/>
       <w:r>
         <w:rPr>
           <w:b w:val="1"/>
@@ -810,8 +769,8 @@
           <w:szCs w:val="46"/>
         </w:rPr>
       </w:pPr>
-      <w:bookmarkStart w:colFirst="0" w:colLast="0" w:name="_hfp37fh5u4cd" w:id="4"/>
-      <w:bookmarkEnd w:id="4"/>
+      <w:bookmarkStart w:colFirst="0" w:colLast="0" w:name="_hfp37fh5u4cd" w:id="3"/>
+      <w:bookmarkEnd w:id="3"/>
       <w:r>
         <w:rPr>
           <w:b w:val="1"/>
@@ -1079,8 +1038,8 @@
           <w:szCs w:val="46"/>
         </w:rPr>
       </w:pPr>
-      <w:bookmarkStart w:colFirst="0" w:colLast="0" w:name="_l5so2rus609x" w:id="5"/>
-      <w:bookmarkEnd w:id="5"/>
+      <w:bookmarkStart w:colFirst="0" w:colLast="0" w:name="_l5so2rus609x" w:id="4"/>
+      <w:bookmarkEnd w:id="4"/>
       <w:r>
         <w:rPr>
           <w:b w:val="1"/>
@@ -1268,8 +1227,8 @@
           <w:szCs w:val="46"/>
         </w:rPr>
       </w:pPr>
-      <w:bookmarkStart w:colFirst="0" w:colLast="0" w:name="_br8sx9f1ltrq" w:id="6"/>
-      <w:bookmarkEnd w:id="6"/>
+      <w:bookmarkStart w:colFirst="0" w:colLast="0" w:name="_br8sx9f1ltrq" w:id="5"/>
+      <w:bookmarkEnd w:id="5"/>
       <w:r>
         <w:rPr>
           <w:b w:val="1"/>
@@ -1421,8 +1380,8 @@
           <w:szCs w:val="46"/>
         </w:rPr>
       </w:pPr>
-      <w:bookmarkStart w:colFirst="0" w:colLast="0" w:name="_2tglebtwgmpe" w:id="7"/>
-      <w:bookmarkEnd w:id="7"/>
+      <w:bookmarkStart w:colFirst="0" w:colLast="0" w:name="_2tglebtwgmpe" w:id="6"/>
+      <w:bookmarkEnd w:id="6"/>
       <w:r>
         <w:rPr>
           <w:b w:val="1"/>
@@ -1522,8 +1481,8 @@
           <w:szCs w:val="46"/>
         </w:rPr>
       </w:pPr>
-      <w:bookmarkStart w:colFirst="0" w:colLast="0" w:name="_bwohbn3m6l9q" w:id="8"/>
-      <w:bookmarkEnd w:id="8"/>
+      <w:bookmarkStart w:colFirst="0" w:colLast="0" w:name="_bwohbn3m6l9q" w:id="7"/>
+      <w:bookmarkEnd w:id="7"/>
       <w:r>
         <w:rPr>
           <w:b w:val="1"/>
@@ -1648,8 +1607,8 @@
           <w:szCs w:val="46"/>
         </w:rPr>
       </w:pPr>
-      <w:bookmarkStart w:colFirst="0" w:colLast="0" w:name="_udf6k3bl19i7" w:id="9"/>
-      <w:bookmarkEnd w:id="9"/>
+      <w:bookmarkStart w:colFirst="0" w:colLast="0" w:name="_udf6k3bl19i7" w:id="8"/>
+      <w:bookmarkEnd w:id="8"/>
       <w:r>
         <w:rPr>
           <w:b w:val="1"/>
@@ -1737,8 +1696,8 @@
           <w:szCs w:val="46"/>
         </w:rPr>
       </w:pPr>
-      <w:bookmarkStart w:colFirst="0" w:colLast="0" w:name="_9490nlygo9nk" w:id="10"/>
-      <w:bookmarkEnd w:id="10"/>
+      <w:bookmarkStart w:colFirst="0" w:colLast="0" w:name="_9490nlygo9nk" w:id="9"/>
+      <w:bookmarkEnd w:id="9"/>
       <w:r>
         <w:rPr>
           <w:b w:val="1"/>
@@ -1878,8 +1837,8 @@
           <w:szCs w:val="46"/>
         </w:rPr>
       </w:pPr>
-      <w:bookmarkStart w:colFirst="0" w:colLast="0" w:name="_kbgvo3sr5es3" w:id="11"/>
-      <w:bookmarkEnd w:id="11"/>
+      <w:bookmarkStart w:colFirst="0" w:colLast="0" w:name="_kbgvo3sr5es3" w:id="10"/>
+      <w:bookmarkEnd w:id="10"/>
       <w:r>
         <w:rPr>
           <w:b w:val="1"/>
@@ -2003,8 +1962,8 @@
           <w:szCs w:val="46"/>
         </w:rPr>
       </w:pPr>
-      <w:bookmarkStart w:colFirst="0" w:colLast="0" w:name="_gfmcxkpqy6j3" w:id="12"/>
-      <w:bookmarkEnd w:id="12"/>
+      <w:bookmarkStart w:colFirst="0" w:colLast="0" w:name="_gfmcxkpqy6j3" w:id="11"/>
+      <w:bookmarkEnd w:id="11"/>
       <w:r>
         <w:rPr>
           <w:b w:val="1"/>
@@ -2092,8 +2051,8 @@
           <w:szCs w:val="46"/>
         </w:rPr>
       </w:pPr>
-      <w:bookmarkStart w:colFirst="0" w:colLast="0" w:name="_jg8fo1icdzml" w:id="13"/>
-      <w:bookmarkEnd w:id="13"/>
+      <w:bookmarkStart w:colFirst="0" w:colLast="0" w:name="_jg8fo1icdzml" w:id="12"/>
+      <w:bookmarkEnd w:id="12"/>
       <w:r>
         <w:rPr>
           <w:b w:val="1"/>
@@ -2237,8 +2196,8 @@
           <w:szCs w:val="46"/>
         </w:rPr>
       </w:pPr>
-      <w:bookmarkStart w:colFirst="0" w:colLast="0" w:name="_qcvwlkel3hsx" w:id="14"/>
-      <w:bookmarkEnd w:id="14"/>
+      <w:bookmarkStart w:colFirst="0" w:colLast="0" w:name="_qcvwlkel3hsx" w:id="13"/>
+      <w:bookmarkEnd w:id="13"/>
       <w:r>
         <w:rPr>
           <w:b w:val="1"/>
@@ -2394,8 +2353,8 @@
           <w:szCs w:val="46"/>
         </w:rPr>
       </w:pPr>
-      <w:bookmarkStart w:colFirst="0" w:colLast="0" w:name="_q0s71apepyhb" w:id="15"/>
-      <w:bookmarkEnd w:id="15"/>
+      <w:bookmarkStart w:colFirst="0" w:colLast="0" w:name="_q0s71apepyhb" w:id="14"/>
+      <w:bookmarkEnd w:id="14"/>
       <w:r>
         <w:rPr>
           <w:b w:val="1"/>
@@ -2532,8 +2491,8 @@
           <w:szCs w:val="46"/>
         </w:rPr>
       </w:pPr>
-      <w:bookmarkStart w:colFirst="0" w:colLast="0" w:name="_bdl5sywjtz7g" w:id="16"/>
-      <w:bookmarkEnd w:id="16"/>
+      <w:bookmarkStart w:colFirst="0" w:colLast="0" w:name="_bdl5sywjtz7g" w:id="15"/>
+      <w:bookmarkEnd w:id="15"/>
       <w:r>
         <w:rPr>
           <w:b w:val="1"/>
@@ -2570,8 +2529,8 @@
           <w:szCs w:val="34"/>
         </w:rPr>
       </w:pPr>
-      <w:bookmarkStart w:colFirst="0" w:colLast="0" w:name="_h0km4zirmppg" w:id="17"/>
-      <w:bookmarkEnd w:id="17"/>
+      <w:bookmarkStart w:colFirst="0" w:colLast="0" w:name="_h0km4zirmppg" w:id="16"/>
+      <w:bookmarkEnd w:id="16"/>
       <w:r>
         <w:rPr>
           <w:b w:val="1"/>
@@ -2635,8 +2594,8 @@
           <w:szCs w:val="34"/>
         </w:rPr>
       </w:pPr>
-      <w:bookmarkStart w:colFirst="0" w:colLast="0" w:name="_qefx9yii5861" w:id="18"/>
-      <w:bookmarkEnd w:id="18"/>
+      <w:bookmarkStart w:colFirst="0" w:colLast="0" w:name="_qefx9yii5861" w:id="17"/>
+      <w:bookmarkEnd w:id="17"/>
       <w:r>
         <w:rPr>
           <w:b w:val="1"/>
@@ -2714,8 +2673,8 @@
           <w:szCs w:val="34"/>
         </w:rPr>
       </w:pPr>
-      <w:bookmarkStart w:colFirst="0" w:colLast="0" w:name="_d72k2hwovsx8" w:id="19"/>
-      <w:bookmarkEnd w:id="19"/>
+      <w:bookmarkStart w:colFirst="0" w:colLast="0" w:name="_d72k2hwovsx8" w:id="18"/>
+      <w:bookmarkEnd w:id="18"/>
       <w:r>
         <w:rPr>
           <w:b w:val="1"/>
@@ -2779,8 +2738,8 @@
           <w:szCs w:val="34"/>
         </w:rPr>
       </w:pPr>
-      <w:bookmarkStart w:colFirst="0" w:colLast="0" w:name="_fk6fmfu4uuvu" w:id="20"/>
-      <w:bookmarkEnd w:id="20"/>
+      <w:bookmarkStart w:colFirst="0" w:colLast="0" w:name="_fk6fmfu4uuvu" w:id="19"/>
+      <w:bookmarkEnd w:id="19"/>
       <w:r>
         <w:rPr>
           <w:b w:val="1"/>
@@ -2870,8 +2829,8 @@
           <w:szCs w:val="34"/>
         </w:rPr>
       </w:pPr>
-      <w:bookmarkStart w:colFirst="0" w:colLast="0" w:name="_i0flx6dxhhdr" w:id="21"/>
-      <w:bookmarkEnd w:id="21"/>
+      <w:bookmarkStart w:colFirst="0" w:colLast="0" w:name="_i0flx6dxhhdr" w:id="20"/>
+      <w:bookmarkEnd w:id="20"/>
       <w:r>
         <w:rPr>
           <w:b w:val="1"/>
@@ -2935,8 +2894,8 @@
           <w:szCs w:val="34"/>
         </w:rPr>
       </w:pPr>
-      <w:bookmarkStart w:colFirst="0" w:colLast="0" w:name="_llwakrctcr0h" w:id="22"/>
-      <w:bookmarkEnd w:id="22"/>
+      <w:bookmarkStart w:colFirst="0" w:colLast="0" w:name="_llwakrctcr0h" w:id="21"/>
+      <w:bookmarkEnd w:id="21"/>
       <w:r>
         <w:rPr>
           <w:b w:val="1"/>
@@ -3084,8 +3043,8 @@
           <w:szCs w:val="46"/>
         </w:rPr>
       </w:pPr>
-      <w:bookmarkStart w:colFirst="0" w:colLast="0" w:name="_ndtp30uiiniw" w:id="23"/>
-      <w:bookmarkEnd w:id="23"/>
+      <w:bookmarkStart w:colFirst="0" w:colLast="0" w:name="_ndtp30uiiniw" w:id="22"/>
+      <w:bookmarkEnd w:id="22"/>
       <w:r>
         <w:rPr>
           <w:b w:val="1"/>
@@ -3213,8 +3172,8 @@
           <w:szCs w:val="46"/>
         </w:rPr>
       </w:pPr>
-      <w:bookmarkStart w:colFirst="0" w:colLast="0" w:name="_f6jprup9bix7" w:id="24"/>
-      <w:bookmarkEnd w:id="24"/>
+      <w:bookmarkStart w:colFirst="0" w:colLast="0" w:name="_f6jprup9bix7" w:id="23"/>
+      <w:bookmarkEnd w:id="23"/>
       <w:r>
         <w:rPr>
           <w:b w:val="1"/>
@@ -3404,8 +3363,8 @@
           <w:szCs w:val="46"/>
         </w:rPr>
       </w:pPr>
-      <w:bookmarkStart w:colFirst="0" w:colLast="0" w:name="_yg8eg1jjilln" w:id="25"/>
-      <w:bookmarkEnd w:id="25"/>
+      <w:bookmarkStart w:colFirst="0" w:colLast="0" w:name="_yg8eg1jjilln" w:id="24"/>
+      <w:bookmarkEnd w:id="24"/>
       <w:r>
         <w:rPr>
           <w:b w:val="1"/>
@@ -3655,8 +3614,8 @@
           <w:szCs w:val="46"/>
         </w:rPr>
       </w:pPr>
-      <w:bookmarkStart w:colFirst="0" w:colLast="0" w:name="_vswq2ercega7" w:id="26"/>
-      <w:bookmarkEnd w:id="26"/>
+      <w:bookmarkStart w:colFirst="0" w:colLast="0" w:name="_vswq2ercega7" w:id="25"/>
+      <w:bookmarkEnd w:id="25"/>
       <w:r>
         <w:rPr>
           <w:b w:val="1"/>

</xml_diff>

<commit_message>
docs:ajustar especificaciones en it-034-001
</commit_message>
<xml_diff>
--- a/docs/IT-034-001 — Execution Domain Model MVP.docx
+++ b/docs/IT-034-001 — Execution Domain Model MVP.docx
@@ -810,7 +810,7 @@
       <w:pPr>
         <w:numPr>
           <w:ilvl w:val="0"/>
-          <w:numId w:val="13"/>
+          <w:numId w:val="16"/>
         </w:numPr>
         <w:spacing w:after="0" w:afterAutospacing="0" w:before="240" w:lineRule="auto"/>
         <w:ind w:left="720" w:hanging="360"/>
@@ -826,7 +826,7 @@
       <w:pPr>
         <w:numPr>
           <w:ilvl w:val="0"/>
-          <w:numId w:val="13"/>
+          <w:numId w:val="16"/>
         </w:numPr>
         <w:spacing w:after="0" w:afterAutospacing="0" w:before="0" w:beforeAutospacing="0" w:lineRule="auto"/>
         <w:ind w:left="720" w:hanging="360"/>
@@ -842,7 +842,7 @@
       <w:pPr>
         <w:numPr>
           <w:ilvl w:val="0"/>
-          <w:numId w:val="13"/>
+          <w:numId w:val="16"/>
         </w:numPr>
         <w:spacing w:after="0" w:afterAutospacing="0" w:before="0" w:beforeAutospacing="0" w:lineRule="auto"/>
         <w:ind w:left="720" w:hanging="360"/>
@@ -858,7 +858,7 @@
       <w:pPr>
         <w:numPr>
           <w:ilvl w:val="0"/>
-          <w:numId w:val="13"/>
+          <w:numId w:val="16"/>
         </w:numPr>
         <w:spacing w:after="0" w:afterAutospacing="0" w:before="0" w:beforeAutospacing="0" w:lineRule="auto"/>
         <w:ind w:left="720" w:hanging="360"/>
@@ -874,7 +874,7 @@
       <w:pPr>
         <w:numPr>
           <w:ilvl w:val="0"/>
-          <w:numId w:val="13"/>
+          <w:numId w:val="16"/>
         </w:numPr>
         <w:spacing w:after="240" w:before="0" w:beforeAutospacing="0" w:lineRule="auto"/>
         <w:ind w:left="720" w:hanging="360"/>
@@ -902,7 +902,7 @@
       <w:pPr>
         <w:numPr>
           <w:ilvl w:val="0"/>
-          <w:numId w:val="12"/>
+          <w:numId w:val="15"/>
         </w:numPr>
         <w:spacing w:after="0" w:afterAutospacing="0" w:before="240" w:lineRule="auto"/>
         <w:ind w:left="720" w:hanging="360"/>
@@ -918,7 +918,7 @@
       <w:pPr>
         <w:numPr>
           <w:ilvl w:val="0"/>
-          <w:numId w:val="12"/>
+          <w:numId w:val="15"/>
         </w:numPr>
         <w:spacing w:after="0" w:afterAutospacing="0" w:before="0" w:beforeAutospacing="0" w:lineRule="auto"/>
         <w:ind w:left="720" w:hanging="360"/>
@@ -934,7 +934,7 @@
       <w:pPr>
         <w:numPr>
           <w:ilvl w:val="0"/>
-          <w:numId w:val="12"/>
+          <w:numId w:val="15"/>
         </w:numPr>
         <w:spacing w:after="0" w:afterAutospacing="0" w:before="0" w:beforeAutospacing="0" w:lineRule="auto"/>
         <w:ind w:left="720" w:hanging="360"/>
@@ -950,7 +950,7 @@
       <w:pPr>
         <w:numPr>
           <w:ilvl w:val="0"/>
-          <w:numId w:val="12"/>
+          <w:numId w:val="15"/>
         </w:numPr>
         <w:spacing w:after="0" w:afterAutospacing="0" w:before="0" w:beforeAutospacing="0" w:lineRule="auto"/>
         <w:ind w:left="720" w:hanging="360"/>
@@ -966,7 +966,7 @@
       <w:pPr>
         <w:numPr>
           <w:ilvl w:val="0"/>
-          <w:numId w:val="12"/>
+          <w:numId w:val="15"/>
         </w:numPr>
         <w:spacing w:after="0" w:afterAutospacing="0" w:before="0" w:beforeAutospacing="0" w:lineRule="auto"/>
         <w:ind w:left="720" w:hanging="360"/>
@@ -982,7 +982,7 @@
       <w:pPr>
         <w:numPr>
           <w:ilvl w:val="0"/>
-          <w:numId w:val="12"/>
+          <w:numId w:val="15"/>
         </w:numPr>
         <w:spacing w:after="0" w:afterAutospacing="0" w:before="0" w:beforeAutospacing="0" w:lineRule="auto"/>
         <w:ind w:left="720" w:hanging="360"/>
@@ -998,7 +998,7 @@
       <w:pPr>
         <w:numPr>
           <w:ilvl w:val="0"/>
-          <w:numId w:val="12"/>
+          <w:numId w:val="15"/>
         </w:numPr>
         <w:spacing w:after="240" w:before="0" w:beforeAutospacing="0" w:lineRule="auto"/>
         <w:ind w:left="720" w:hanging="360"/>
@@ -1079,7 +1079,7 @@
       <w:pPr>
         <w:numPr>
           <w:ilvl w:val="0"/>
-          <w:numId w:val="16"/>
+          <w:numId w:val="20"/>
         </w:numPr>
         <w:spacing w:after="240" w:before="240" w:lineRule="auto"/>
         <w:ind w:left="720" w:hanging="360"/>
@@ -1107,7 +1107,7 @@
       <w:pPr>
         <w:numPr>
           <w:ilvl w:val="0"/>
-          <w:numId w:val="1"/>
+          <w:numId w:val="3"/>
         </w:numPr>
         <w:spacing w:after="0" w:afterAutospacing="0" w:before="240" w:lineRule="auto"/>
         <w:ind w:left="720" w:hanging="360"/>
@@ -1123,7 +1123,7 @@
       <w:pPr>
         <w:numPr>
           <w:ilvl w:val="0"/>
-          <w:numId w:val="1"/>
+          <w:numId w:val="3"/>
         </w:numPr>
         <w:spacing w:after="0" w:afterAutospacing="0" w:before="0" w:beforeAutospacing="0" w:lineRule="auto"/>
         <w:ind w:left="720" w:hanging="360"/>
@@ -1139,7 +1139,7 @@
       <w:pPr>
         <w:numPr>
           <w:ilvl w:val="0"/>
-          <w:numId w:val="1"/>
+          <w:numId w:val="3"/>
         </w:numPr>
         <w:spacing w:after="0" w:afterAutospacing="0" w:before="0" w:beforeAutospacing="0" w:lineRule="auto"/>
         <w:ind w:left="720" w:hanging="360"/>
@@ -1155,7 +1155,7 @@
       <w:pPr>
         <w:numPr>
           <w:ilvl w:val="0"/>
-          <w:numId w:val="1"/>
+          <w:numId w:val="3"/>
         </w:numPr>
         <w:spacing w:after="0" w:afterAutospacing="0" w:before="0" w:beforeAutospacing="0" w:lineRule="auto"/>
         <w:ind w:left="720" w:hanging="360"/>
@@ -1171,7 +1171,7 @@
       <w:pPr>
         <w:numPr>
           <w:ilvl w:val="0"/>
-          <w:numId w:val="1"/>
+          <w:numId w:val="3"/>
         </w:numPr>
         <w:spacing w:after="0" w:afterAutospacing="0" w:before="0" w:beforeAutospacing="0" w:lineRule="auto"/>
         <w:ind w:left="720" w:hanging="360"/>
@@ -1187,7 +1187,7 @@
       <w:pPr>
         <w:numPr>
           <w:ilvl w:val="0"/>
-          <w:numId w:val="1"/>
+          <w:numId w:val="3"/>
         </w:numPr>
         <w:spacing w:after="240" w:before="0" w:beforeAutospacing="0" w:lineRule="auto"/>
         <w:ind w:left="720" w:hanging="360"/>
@@ -1249,50 +1249,82 @@
         <w:rPr>
           <w:rtl w:val="0"/>
         </w:rPr>
-        <w:t xml:space="preserve">Execution publicará un único contrato público del dominio.</w:t>
-      </w:r>
-    </w:p>
-    <w:p>
-      <w:pPr>
-        <w:spacing w:after="240" w:before="240" w:lineRule="auto"/>
-        <w:rPr/>
-      </w:pPr>
-      <w:r>
-        <w:rPr>
-          <w:rtl w:val="0"/>
-        </w:rPr>
-        <w:t xml:space="preserve">Ese contrato constituye el resultado completo de la responsabilidad de la Capability.</w:t>
-      </w:r>
-    </w:p>
-    <w:p>
-      <w:pPr>
-        <w:spacing w:after="240" w:before="240" w:lineRule="auto"/>
-        <w:rPr/>
-      </w:pPr>
-      <w:r>
-        <w:rPr>
-          <w:rtl w:val="0"/>
-        </w:rPr>
-        <w:t xml:space="preserve">Representa la totalidad de las operaciones necesarias para materializar una única PortfolioTransition válida.</w:t>
-      </w:r>
-    </w:p>
-    <w:p>
-      <w:pPr>
-        <w:spacing w:after="240" w:before="240" w:lineRule="auto"/>
-        <w:rPr/>
-      </w:pPr>
-      <w:r>
-        <w:rPr>
-          <w:rtl w:val="0"/>
-        </w:rPr>
-        <w:t xml:space="preserve">No representa:</w:t>
-      </w:r>
-    </w:p>
-    <w:p>
-      <w:pPr>
-        <w:numPr>
-          <w:ilvl w:val="0"/>
-          <w:numId w:val="8"/>
+        <w:t xml:space="preserve">Execution materializará y publicará un único contrato público principal denominado </w:t>
+      </w:r>
+      <w:r>
+        <w:rPr>
+          <w:b w:val="1"/>
+          <w:bCs w:val="1"/>
+          <w:rtl w:val="0"/>
+        </w:rPr>
+        <w:t xml:space="preserve">OperationalIntent</w:t>
+      </w:r>
+      <w:r>
+        <w:rPr>
+          <w:rtl w:val="0"/>
+        </w:rPr>
+        <w:t xml:space="preserve">.</w:t>
+      </w:r>
+    </w:p>
+    <w:p>
+      <w:pPr>
+        <w:spacing w:after="240" w:before="240" w:lineRule="auto"/>
+        <w:rPr/>
+      </w:pPr>
+      <w:r>
+        <w:rPr>
+          <w:rFonts w:ascii="Roboto Mono" w:cs="Roboto Mono" w:eastAsia="Roboto Mono" w:hAnsi="Roboto Mono"/>
+          <w:color w:val="188038"/>
+          <w:rtl w:val="0"/>
+        </w:rPr>
+        <w:t xml:space="preserve">OperationalIntent</w:t>
+      </w:r>
+      <w:r>
+        <w:rPr>
+          <w:rtl w:val="0"/>
+        </w:rPr>
+        <w:t xml:space="preserve"> representa la intención operacional completa determinada por Execution para materializar una única </w:t>
+      </w:r>
+      <w:r>
+        <w:rPr>
+          <w:rFonts w:ascii="Roboto Mono" w:cs="Roboto Mono" w:eastAsia="Roboto Mono" w:hAnsi="Roboto Mono"/>
+          <w:color w:val="188038"/>
+          <w:rtl w:val="0"/>
+        </w:rPr>
+        <w:t xml:space="preserve">PortfolioTransition</w:t>
+      </w:r>
+      <w:r>
+        <w:rPr>
+          <w:rtl w:val="0"/>
+        </w:rPr>
+        <w:t xml:space="preserve"> válida. </w:t>
+      </w:r>
+    </w:p>
+    <w:p>
+      <w:pPr>
+        <w:spacing w:after="240" w:before="240" w:lineRule="auto"/>
+        <w:rPr/>
+      </w:pPr>
+      <w:r>
+        <w:rPr>
+          <w:rFonts w:ascii="Roboto Mono" w:cs="Roboto Mono" w:eastAsia="Roboto Mono" w:hAnsi="Roboto Mono"/>
+          <w:color w:val="188038"/>
+          <w:rtl w:val="0"/>
+        </w:rPr>
+        <w:t xml:space="preserve">OperationalIntent</w:t>
+      </w:r>
+      <w:r>
+        <w:rPr>
+          <w:rtl w:val="0"/>
+        </w:rPr>
+        <w:t xml:space="preserve"> no representa:</w:t>
+      </w:r>
+    </w:p>
+    <w:p>
+      <w:pPr>
+        <w:numPr>
+          <w:ilvl w:val="0"/>
+          <w:numId w:val="11"/>
         </w:numPr>
         <w:spacing w:after="0" w:afterAutospacing="0" w:before="240" w:lineRule="auto"/>
         <w:ind w:left="720" w:hanging="360"/>
@@ -1301,14 +1333,14 @@
         <w:rPr>
           <w:rtl w:val="0"/>
         </w:rPr>
-        <w:t xml:space="preserve">órdenes del broker;</w:t>
-      </w:r>
-    </w:p>
-    <w:p>
-      <w:pPr>
-        <w:numPr>
-          <w:ilvl w:val="0"/>
-          <w:numId w:val="8"/>
+        <w:t xml:space="preserve">una orden de broker;</w:t>
+      </w:r>
+    </w:p>
+    <w:p>
+      <w:pPr>
+        <w:numPr>
+          <w:ilvl w:val="0"/>
+          <w:numId w:val="11"/>
         </w:numPr>
         <w:spacing w:after="0" w:afterAutospacing="0" w:before="0" w:beforeAutospacing="0" w:lineRule="auto"/>
         <w:ind w:left="720" w:hanging="360"/>
@@ -1317,14 +1349,14 @@
         <w:rPr>
           <w:rtl w:val="0"/>
         </w:rPr>
-        <w:t xml:space="preserve">mensajes de infraestructura;</w:t>
-      </w:r>
-    </w:p>
-    <w:p>
-      <w:pPr>
-        <w:numPr>
-          <w:ilvl w:val="0"/>
-          <w:numId w:val="8"/>
+        <w:t xml:space="preserve">una ejecución realizada;</w:t>
+      </w:r>
+    </w:p>
+    <w:p>
+      <w:pPr>
+        <w:numPr>
+          <w:ilvl w:val="0"/>
+          <w:numId w:val="11"/>
         </w:numPr>
         <w:spacing w:after="0" w:afterAutospacing="0" w:before="0" w:beforeAutospacing="0" w:lineRule="auto"/>
         <w:ind w:left="720" w:hanging="360"/>
@@ -1333,14 +1365,14 @@
         <w:rPr>
           <w:rtl w:val="0"/>
         </w:rPr>
-        <w:t xml:space="preserve">resultados de ejecución;</w:t>
-      </w:r>
-    </w:p>
-    <w:p>
-      <w:pPr>
-        <w:numPr>
-          <w:ilvl w:val="0"/>
-          <w:numId w:val="8"/>
+        <w:t xml:space="preserve">una estrategia de ejecución;</w:t>
+      </w:r>
+    </w:p>
+    <w:p>
+      <w:pPr>
+        <w:numPr>
+          <w:ilvl w:val="0"/>
+          <w:numId w:val="11"/>
         </w:numPr>
         <w:spacing w:after="240" w:before="0" w:beforeAutospacing="0" w:lineRule="auto"/>
         <w:ind w:left="720" w:hanging="360"/>
@@ -1349,7 +1381,30 @@
         <w:rPr>
           <w:rtl w:val="0"/>
         </w:rPr>
-        <w:t xml:space="preserve">confirmaciones externas.</w:t>
+        <w:t xml:space="preserve">una instrucción dirigida a infraestructura específica.</w:t>
+      </w:r>
+    </w:p>
+    <w:p>
+      <w:pPr>
+        <w:spacing w:after="240" w:before="240" w:lineRule="auto"/>
+        <w:rPr/>
+      </w:pPr>
+      <w:r>
+        <w:rPr>
+          <w:rtl w:val="0"/>
+        </w:rPr>
+        <w:t xml:space="preserve">Constituye exclusivamente el resultado contractual de la responsabilidad de Execution.</w:t>
+      </w:r>
+    </w:p>
+    <w:p>
+      <w:pPr>
+        <w:spacing w:after="240" w:before="240" w:lineRule="auto"/>
+        <w:rPr/>
+      </w:pPr>
+      <w:r>
+        <w:rPr>
+          <w:rtl w:val="0"/>
+        </w:rPr>
       </w:r>
     </w:p>
     <w:p>
@@ -1455,6 +1510,86 @@
     </w:p>
     <w:p>
       <w:pPr>
+        <w:spacing w:after="240" w:before="240" w:lineRule="auto"/>
+        <w:rPr/>
+      </w:pPr>
+      <w:r>
+        <w:rPr>
+          <w:rtl w:val="0"/>
+        </w:rPr>
+      </w:r>
+    </w:p>
+    <w:p>
+      <w:pPr>
+        <w:spacing w:after="240" w:before="240" w:lineRule="auto"/>
+        <w:rPr/>
+      </w:pPr>
+      <w:r>
+        <w:rPr>
+          <w:rFonts w:ascii="Roboto Mono" w:cs="Roboto Mono" w:eastAsia="Roboto Mono" w:hAnsi="Roboto Mono"/>
+          <w:color w:val="188038"/>
+          <w:rtl w:val="0"/>
+        </w:rPr>
+        <w:t xml:space="preserve">OperationalIntent</w:t>
+      </w:r>
+      <w:r>
+        <w:rPr>
+          <w:rtl w:val="0"/>
+        </w:rPr>
+        <w:t xml:space="preserve"> deberá preservar una relación contractual inequívoca con la única </w:t>
+      </w:r>
+      <w:r>
+        <w:rPr>
+          <w:rFonts w:ascii="Roboto Mono" w:cs="Roboto Mono" w:eastAsia="Roboto Mono" w:hAnsi="Roboto Mono"/>
+          <w:color w:val="188038"/>
+          <w:rtl w:val="0"/>
+        </w:rPr>
+        <w:t xml:space="preserve">PortfolioTransition</w:t>
+      </w:r>
+      <w:r>
+        <w:rPr>
+          <w:rtl w:val="0"/>
+        </w:rPr>
+        <w:t xml:space="preserve"> que le dio origen.</w:t>
+      </w:r>
+    </w:p>
+    <w:p>
+      <w:pPr>
+        <w:spacing w:after="240" w:before="240" w:lineRule="auto"/>
+        <w:rPr/>
+      </w:pPr>
+      <w:r>
+        <w:rPr>
+          <w:rtl w:val="0"/>
+        </w:rPr>
+        <w:t xml:space="preserve">Esta relación forma parte de la trazabilidad pública del activo.</w:t>
+      </w:r>
+    </w:p>
+    <w:p>
+      <w:pPr>
+        <w:spacing w:after="240" w:before="240" w:lineRule="auto"/>
+        <w:rPr/>
+      </w:pPr>
+      <w:r>
+        <w:rPr>
+          <w:rtl w:val="0"/>
+        </w:rPr>
+        <w:t xml:space="preserve">La especificación no prescribe el mecanismo interno mediante el cual la implementación materialice identidad, igualdad, hashing o reproducibilidad.</w:t>
+      </w:r>
+    </w:p>
+    <w:p>
+      <w:pPr>
+        <w:spacing w:after="240" w:before="240" w:lineRule="auto"/>
+        <w:rPr/>
+      </w:pPr>
+      <w:r>
+        <w:rPr>
+          <w:rtl w:val="0"/>
+        </w:rPr>
+      </w:r>
+    </w:p>
+    <w:p>
+      <w:pPr>
         <w:rPr/>
       </w:pPr>
       <w:r>
@@ -1501,21 +1636,462 @@
       </w:pPr>
       <w:r>
         <w:rPr>
-          <w:rtl w:val="0"/>
-        </w:rPr>
-        <w:t xml:space="preserve">El contrato público estará constituido exclusivamente por valores del dominio que representen operaciones de inversión necesarias para materializar la transición recibida.</w:t>
-      </w:r>
-    </w:p>
-    <w:p>
-      <w:pPr>
-        <w:spacing w:after="240" w:before="240" w:lineRule="auto"/>
-        <w:rPr/>
-      </w:pPr>
-      <w:r>
-        <w:rPr>
-          <w:rtl w:val="0"/>
-        </w:rPr>
-        <w:t xml:space="preserve">Cada valor constitutivo:</w:t>
+          <w:rFonts w:ascii="Roboto Mono" w:cs="Roboto Mono" w:eastAsia="Roboto Mono" w:hAnsi="Roboto Mono"/>
+          <w:color w:val="188038"/>
+          <w:rtl w:val="0"/>
+        </w:rPr>
+        <w:t xml:space="preserve">OperationalIntent</w:t>
+      </w:r>
+      <w:r>
+        <w:rPr>
+          <w:rtl w:val="0"/>
+        </w:rPr>
+        <w:t xml:space="preserve"> estará constituido por valores públicos de dominio denominados </w:t>
+      </w:r>
+      <w:r>
+        <w:rPr>
+          <w:b w:val="1"/>
+          <w:bCs w:val="1"/>
+          <w:rtl w:val="0"/>
+        </w:rPr>
+        <w:t xml:space="preserve">InvestmentOperation</w:t>
+      </w:r>
+      <w:r>
+        <w:rPr>
+          <w:rtl w:val="0"/>
+        </w:rPr>
+        <w:t xml:space="preserve">.</w:t>
+      </w:r>
+    </w:p>
+    <w:p>
+      <w:pPr>
+        <w:spacing w:after="240" w:before="240" w:lineRule="auto"/>
+        <w:rPr/>
+      </w:pPr>
+      <w:r>
+        <w:rPr>
+          <w:rtl w:val="0"/>
+        </w:rPr>
+        <w:t xml:space="preserve">Cada </w:t>
+      </w:r>
+      <w:r>
+        <w:rPr>
+          <w:rFonts w:ascii="Roboto Mono" w:cs="Roboto Mono" w:eastAsia="Roboto Mono" w:hAnsi="Roboto Mono"/>
+          <w:color w:val="188038"/>
+          <w:rtl w:val="0"/>
+        </w:rPr>
+        <w:t xml:space="preserve">InvestmentOperation</w:t>
+      </w:r>
+      <w:r>
+        <w:rPr>
+          <w:rtl w:val="0"/>
+        </w:rPr>
+        <w:t xml:space="preserve"> representa exactamente una acción operacional sobre un instrumento determinada a partir de una </w:t>
+      </w:r>
+      <w:r>
+        <w:rPr>
+          <w:rFonts w:ascii="Roboto Mono" w:cs="Roboto Mono" w:eastAsia="Roboto Mono" w:hAnsi="Roboto Mono"/>
+          <w:color w:val="188038"/>
+          <w:rtl w:val="0"/>
+        </w:rPr>
+        <w:t xml:space="preserve">PortfolioPositionTransition</w:t>
+      </w:r>
+      <w:r>
+        <w:rPr>
+          <w:rtl w:val="0"/>
+        </w:rPr>
+        <w:t xml:space="preserve">.</w:t>
+      </w:r>
+    </w:p>
+    <w:p>
+      <w:pPr>
+        <w:spacing w:after="240" w:before="240" w:lineRule="auto"/>
+        <w:rPr/>
+      </w:pPr>
+      <w:r>
+        <w:rPr>
+          <w:rtl w:val="0"/>
+        </w:rPr>
+        <w:t xml:space="preserve">Cada operación deberá expresar públicamente:</w:t>
+      </w:r>
+    </w:p>
+    <w:p>
+      <w:pPr>
+        <w:numPr>
+          <w:ilvl w:val="0"/>
+          <w:numId w:val="7"/>
+        </w:numPr>
+        <w:spacing w:after="0" w:afterAutospacing="0" w:before="240" w:lineRule="auto"/>
+        <w:ind w:left="720" w:hanging="360"/>
+      </w:pPr>
+      <w:r>
+        <w:rPr>
+          <w:rtl w:val="0"/>
+        </w:rPr>
+        <w:t xml:space="preserve">el instrumento afectado;</w:t>
+      </w:r>
+    </w:p>
+    <w:p>
+      <w:pPr>
+        <w:numPr>
+          <w:ilvl w:val="0"/>
+          <w:numId w:val="7"/>
+        </w:numPr>
+        <w:spacing w:after="0" w:afterAutospacing="0" w:before="0" w:beforeAutospacing="0" w:lineRule="auto"/>
+        <w:ind w:left="720" w:hanging="360"/>
+      </w:pPr>
+      <w:r>
+        <w:rPr>
+          <w:rtl w:val="0"/>
+        </w:rPr>
+        <w:t xml:space="preserve">la dirección operacional;</w:t>
+      </w:r>
+    </w:p>
+    <w:p>
+      <w:pPr>
+        <w:numPr>
+          <w:ilvl w:val="0"/>
+          <w:numId w:val="7"/>
+        </w:numPr>
+        <w:spacing w:after="240" w:before="0" w:beforeAutospacing="0" w:lineRule="auto"/>
+        <w:ind w:left="720" w:hanging="360"/>
+      </w:pPr>
+      <w:r>
+        <w:rPr>
+          <w:rtl w:val="0"/>
+        </w:rPr>
+        <w:t xml:space="preserve">la magnitud de la cantidad correspondiente.</w:t>
+      </w:r>
+    </w:p>
+    <w:p>
+      <w:pPr>
+        <w:spacing w:after="240" w:before="240" w:lineRule="auto"/>
+        <w:rPr/>
+      </w:pPr>
+      <w:r>
+        <w:rPr>
+          <w:rtl w:val="0"/>
+        </w:rPr>
+        <w:t xml:space="preserve">Las únicas direcciones operacionales autorizadas por el presente incremento son:</w:t>
+      </w:r>
+    </w:p>
+    <w:p>
+      <w:pPr>
+        <w:numPr>
+          <w:ilvl w:val="0"/>
+          <w:numId w:val="17"/>
+        </w:numPr>
+        <w:spacing w:after="0" w:afterAutospacing="0" w:before="240" w:lineRule="auto"/>
+        <w:ind w:left="720" w:hanging="360"/>
+      </w:pPr>
+      <w:r>
+        <w:rPr>
+          <w:b w:val="1"/>
+          <w:bCs w:val="1"/>
+          <w:rtl w:val="0"/>
+        </w:rPr>
+        <w:t xml:space="preserve">BUY</w:t>
+      </w:r>
+    </w:p>
+    <w:p>
+      <w:pPr>
+        <w:numPr>
+          <w:ilvl w:val="0"/>
+          <w:numId w:val="17"/>
+        </w:numPr>
+        <w:spacing w:after="240" w:before="0" w:beforeAutospacing="0" w:lineRule="auto"/>
+        <w:ind w:left="720" w:hanging="360"/>
+      </w:pPr>
+      <w:r>
+        <w:rPr>
+          <w:b w:val="1"/>
+          <w:bCs w:val="1"/>
+          <w:rtl w:val="0"/>
+        </w:rPr>
+        <w:t xml:space="preserve">SELL</w:t>
+      </w:r>
+    </w:p>
+    <w:p>
+      <w:pPr>
+        <w:spacing w:after="240" w:before="240" w:lineRule="auto"/>
+        <w:rPr/>
+      </w:pPr>
+      <w:r>
+        <w:rPr>
+          <w:rFonts w:ascii="Roboto Mono" w:cs="Roboto Mono" w:eastAsia="Roboto Mono" w:hAnsi="Roboto Mono"/>
+          <w:color w:val="188038"/>
+          <w:rtl w:val="0"/>
+        </w:rPr>
+        <w:t xml:space="preserve">InvestmentOperation</w:t>
+      </w:r>
+      <w:r>
+        <w:rPr>
+          <w:rtl w:val="0"/>
+        </w:rPr>
+        <w:t xml:space="preserve"> constituye un valor público constitutivo de </w:t>
+      </w:r>
+      <w:r>
+        <w:rPr>
+          <w:rFonts w:ascii="Roboto Mono" w:cs="Roboto Mono" w:eastAsia="Roboto Mono" w:hAnsi="Roboto Mono"/>
+          <w:color w:val="188038"/>
+          <w:rtl w:val="0"/>
+        </w:rPr>
+        <w:t xml:space="preserve">OperationalIntent</w:t>
+      </w:r>
+      <w:r>
+        <w:rPr>
+          <w:rtl w:val="0"/>
+        </w:rPr>
+        <w:t xml:space="preserve">.</w:t>
+      </w:r>
+    </w:p>
+    <w:p>
+      <w:pPr>
+        <w:spacing w:after="240" w:before="240" w:lineRule="auto"/>
+        <w:rPr/>
+      </w:pPr>
+      <w:r>
+        <w:rPr>
+          <w:rtl w:val="0"/>
+        </w:rPr>
+        <w:t xml:space="preserve">No constituye un activo contractual independiente ni una salida adicional de la Capability.</w:t>
+      </w:r>
+    </w:p>
+    <w:p>
+      <w:pPr>
+        <w:pStyle w:val="Heading2"/>
+        <w:keepNext w:val="0"/>
+        <w:keepLines w:val="0"/>
+        <w:spacing w:after="80" w:lineRule="auto"/>
+        <w:rPr>
+          <w:b w:val="1"/>
+          <w:bCs w:val="1"/>
+          <w:sz w:val="34"/>
+          <w:szCs w:val="34"/>
+        </w:rPr>
+      </w:pPr>
+      <w:bookmarkStart w:colFirst="0" w:colLast="0" w:name="_2vdh99285mvl" w:id="8"/>
+      <w:bookmarkEnd w:id="8"/>
+      <w:r>
+        <w:rPr>
+          <w:b w:val="1"/>
+          <w:bCs w:val="1"/>
+          <w:sz w:val="34"/>
+          <w:szCs w:val="34"/>
+          <w:rtl w:val="0"/>
+        </w:rPr>
+        <w:t xml:space="preserve">7.1 — Semántica de traducción de posiciones</w:t>
+      </w:r>
+    </w:p>
+    <w:p>
+      <w:pPr>
+        <w:spacing w:after="240" w:before="240" w:lineRule="auto"/>
+        <w:ind w:left="600" w:right="600" w:firstLine="0"/>
+        <w:rPr/>
+      </w:pPr>
+      <w:r>
+        <w:rPr>
+          <w:rtl w:val="0"/>
+        </w:rPr>
+        <w:t xml:space="preserve">Cada </w:t>
+      </w:r>
+      <w:r>
+        <w:rPr>
+          <w:rFonts w:ascii="Roboto Mono" w:cs="Roboto Mono" w:eastAsia="Roboto Mono" w:hAnsi="Roboto Mono"/>
+          <w:color w:val="188038"/>
+          <w:rtl w:val="0"/>
+        </w:rPr>
+        <w:t xml:space="preserve">PortfolioPositionTransition</w:t>
+      </w:r>
+      <w:r>
+        <w:rPr>
+          <w:rtl w:val="0"/>
+        </w:rPr>
+        <w:t xml:space="preserve"> material deberá corresponder exactamente a una </w:t>
+      </w:r>
+      <w:r>
+        <w:rPr>
+          <w:rFonts w:ascii="Roboto Mono" w:cs="Roboto Mono" w:eastAsia="Roboto Mono" w:hAnsi="Roboto Mono"/>
+          <w:color w:val="188038"/>
+          <w:rtl w:val="0"/>
+        </w:rPr>
+        <w:t xml:space="preserve">InvestmentOperation</w:t>
+      </w:r>
+      <w:r>
+        <w:rPr>
+          <w:rtl w:val="0"/>
+        </w:rPr>
+        <w:t xml:space="preserve">.</w:t>
+      </w:r>
+    </w:p>
+    <w:p>
+      <w:pPr>
+        <w:spacing w:after="240" w:before="240" w:lineRule="auto"/>
+        <w:ind w:left="600" w:right="600" w:firstLine="0"/>
+        <w:rPr/>
+      </w:pPr>
+      <w:r>
+        <w:rPr>
+          <w:rtl w:val="0"/>
+        </w:rPr>
+        <w:t xml:space="preserve">Cuando la transición de posición represente un incremento de cantidad, la operación resultante tendrá semántica </w:t>
+      </w:r>
+      <w:r>
+        <w:rPr>
+          <w:b w:val="1"/>
+          <w:bCs w:val="1"/>
+          <w:rtl w:val="0"/>
+        </w:rPr>
+        <w:t xml:space="preserve">BUY</w:t>
+      </w:r>
+      <w:r>
+        <w:rPr>
+          <w:rtl w:val="0"/>
+        </w:rPr>
+        <w:t xml:space="preserve">.</w:t>
+      </w:r>
+    </w:p>
+    <w:p>
+      <w:pPr>
+        <w:spacing w:after="240" w:before="240" w:lineRule="auto"/>
+        <w:ind w:left="600" w:right="600" w:firstLine="0"/>
+        <w:rPr/>
+      </w:pPr>
+      <w:r>
+        <w:rPr>
+          <w:rtl w:val="0"/>
+        </w:rPr>
+        <w:t xml:space="preserve">Cuando la transición de posición represente una reducción de cantidad, la operación resultante tendrá semántica </w:t>
+      </w:r>
+      <w:r>
+        <w:rPr>
+          <w:b w:val="1"/>
+          <w:bCs w:val="1"/>
+          <w:rtl w:val="0"/>
+        </w:rPr>
+        <w:t xml:space="preserve">SELL</w:t>
+      </w:r>
+      <w:r>
+        <w:rPr>
+          <w:rtl w:val="0"/>
+        </w:rPr>
+        <w:t xml:space="preserve">.</w:t>
+      </w:r>
+    </w:p>
+    <w:p>
+      <w:pPr>
+        <w:spacing w:after="240" w:before="240" w:lineRule="auto"/>
+        <w:ind w:left="600" w:right="600" w:firstLine="0"/>
+        <w:rPr/>
+      </w:pPr>
+      <w:r>
+        <w:rPr>
+          <w:rtl w:val="0"/>
+        </w:rPr>
+        <w:t xml:space="preserve">La magnitud operacional corresponderá a la magnitud material de la transformación de posición.</w:t>
+      </w:r>
+    </w:p>
+    <w:p>
+      <w:pPr>
+        <w:spacing w:after="240" w:before="240" w:lineRule="auto"/>
+        <w:ind w:left="600" w:right="600" w:firstLine="0"/>
+        <w:rPr/>
+      </w:pPr>
+      <w:r>
+        <w:rPr>
+          <w:rtl w:val="0"/>
+        </w:rPr>
+        <w:t xml:space="preserve">Esta sección determina la semántica contractual de la relación.</w:t>
+      </w:r>
+    </w:p>
+    <w:p>
+      <w:pPr>
+        <w:spacing w:after="240" w:before="240" w:lineRule="auto"/>
+        <w:ind w:left="600" w:right="600" w:firstLine="0"/>
+        <w:rPr/>
+      </w:pPr>
+      <w:r>
+        <w:rPr>
+          <w:rtl w:val="0"/>
+        </w:rPr>
+        <w:t xml:space="preserve">No prescribe el algoritmo utilizado para materializarla.</w:t>
+      </w:r>
+    </w:p>
+    <w:p>
+      <w:pPr>
+        <w:pStyle w:val="Heading2"/>
+        <w:keepNext w:val="0"/>
+        <w:keepLines w:val="0"/>
+        <w:spacing w:after="80" w:lineRule="auto"/>
+        <w:rPr>
+          <w:b w:val="1"/>
+          <w:bCs w:val="1"/>
+          <w:sz w:val="34"/>
+          <w:szCs w:val="34"/>
+        </w:rPr>
+      </w:pPr>
+      <w:bookmarkStart w:colFirst="0" w:colLast="0" w:name="_u9sby6m2thlc" w:id="9"/>
+      <w:bookmarkEnd w:id="9"/>
+      <w:r>
+        <w:rPr>
+          <w:b w:val="1"/>
+          <w:bCs w:val="1"/>
+          <w:sz w:val="34"/>
+          <w:szCs w:val="34"/>
+          <w:rtl w:val="0"/>
+        </w:rPr>
+        <w:t xml:space="preserve">7.2 — Tratamiento de transformaciones monetarias</w:t>
+      </w:r>
+    </w:p>
+    <w:p>
+      <w:pPr>
+        <w:spacing w:after="240" w:before="240" w:lineRule="auto"/>
+        <w:rPr/>
+      </w:pPr>
+      <w:r>
+        <w:rPr>
+          <w:rtl w:val="0"/>
+        </w:rPr>
+      </w:r>
+    </w:p>
+    <w:p>
+      <w:pPr>
+        <w:spacing w:after="240" w:before="240" w:lineRule="auto"/>
+        <w:ind w:left="600" w:right="600" w:firstLine="0"/>
+        <w:rPr/>
+      </w:pPr>
+      <w:r>
+        <w:rPr>
+          <w:rtl w:val="0"/>
+        </w:rPr>
+        <w:t xml:space="preserve">Una </w:t>
+      </w:r>
+      <w:r>
+        <w:rPr>
+          <w:rFonts w:ascii="Roboto Mono" w:cs="Roboto Mono" w:eastAsia="Roboto Mono" w:hAnsi="Roboto Mono"/>
+          <w:color w:val="188038"/>
+          <w:rtl w:val="0"/>
+        </w:rPr>
+        <w:t xml:space="preserve">PortfolioMonetaryTransition</w:t>
+      </w:r>
+      <w:r>
+        <w:rPr>
+          <w:rtl w:val="0"/>
+        </w:rPr>
+        <w:t xml:space="preserve"> no constituye por sí misma una operación autónoma de inversión dentro del alcance de IT-034-001.</w:t>
+      </w:r>
+    </w:p>
+    <w:p>
+      <w:pPr>
+        <w:spacing w:after="240" w:before="240" w:lineRule="auto"/>
+        <w:ind w:left="600" w:right="600" w:firstLine="0"/>
+        <w:rPr/>
+      </w:pPr>
+      <w:r>
+        <w:rPr>
+          <w:rtl w:val="0"/>
+        </w:rPr>
+        <w:t xml:space="preserve">El presente incremento no autoriza interpretar automáticamente una transformación monetaria como:</w:t>
       </w:r>
     </w:p>
     <w:p>
@@ -1525,13 +2101,13 @@
           <w:numId w:val="5"/>
         </w:numPr>
         <w:spacing w:after="0" w:afterAutospacing="0" w:before="240" w:lineRule="auto"/>
-        <w:ind w:left="720" w:hanging="360"/>
-      </w:pPr>
-      <w:r>
-        <w:rPr>
-          <w:rtl w:val="0"/>
-        </w:rPr>
-        <w:t xml:space="preserve">representa una única operación del dominio;</w:t>
+        <w:ind w:left="1320" w:right="600" w:hanging="360"/>
+      </w:pPr>
+      <w:r>
+        <w:rPr>
+          <w:rtl w:val="0"/>
+        </w:rPr>
+        <w:t xml:space="preserve">operación de divisas;</w:t>
       </w:r>
     </w:p>
     <w:p>
@@ -1541,13 +2117,13 @@
           <w:numId w:val="5"/>
         </w:numPr>
         <w:spacing w:after="0" w:afterAutospacing="0" w:before="0" w:beforeAutospacing="0" w:lineRule="auto"/>
-        <w:ind w:left="720" w:hanging="360"/>
-      </w:pPr>
-      <w:r>
-        <w:rPr>
-          <w:rtl w:val="0"/>
-        </w:rPr>
-        <w:t xml:space="preserve">pertenece exclusivamente al contrato principal;</w:t>
+        <w:ind w:left="1320" w:right="600" w:hanging="360"/>
+      </w:pPr>
+      <w:r>
+        <w:rPr>
+          <w:rtl w:val="0"/>
+        </w:rPr>
+        <w:t xml:space="preserve">transferencia;</w:t>
       </w:r>
     </w:p>
     <w:p>
@@ -1557,13 +2133,13 @@
           <w:numId w:val="5"/>
         </w:numPr>
         <w:spacing w:after="0" w:afterAutospacing="0" w:before="0" w:beforeAutospacing="0" w:lineRule="auto"/>
-        <w:ind w:left="720" w:hanging="360"/>
-      </w:pPr>
-      <w:r>
-        <w:rPr>
-          <w:rtl w:val="0"/>
-        </w:rPr>
-        <w:t xml:space="preserve">no constituye un contrato público independiente;</w:t>
+        <w:ind w:left="1320" w:right="600" w:hanging="360"/>
+      </w:pPr>
+      <w:r>
+        <w:rPr>
+          <w:rtl w:val="0"/>
+        </w:rPr>
+        <w:t xml:space="preserve">depósito;</w:t>
       </w:r>
     </w:p>
     <w:p>
@@ -1572,26 +2148,97 @@
           <w:ilvl w:val="0"/>
           <w:numId w:val="5"/>
         </w:numPr>
+        <w:spacing w:after="0" w:afterAutospacing="0" w:before="0" w:beforeAutospacing="0" w:lineRule="auto"/>
+        <w:ind w:left="1320" w:right="600" w:hanging="360"/>
+      </w:pPr>
+      <w:r>
+        <w:rPr>
+          <w:rtl w:val="0"/>
+        </w:rPr>
+        <w:t xml:space="preserve">retiro;</w:t>
+      </w:r>
+    </w:p>
+    <w:p>
+      <w:pPr>
+        <w:numPr>
+          <w:ilvl w:val="0"/>
+          <w:numId w:val="5"/>
+        </w:numPr>
+        <w:spacing w:after="0" w:afterAutospacing="0" w:before="0" w:beforeAutospacing="0" w:lineRule="auto"/>
+        <w:ind w:left="1320" w:right="600" w:hanging="360"/>
+      </w:pPr>
+      <w:r>
+        <w:rPr>
+          <w:rtl w:val="0"/>
+        </w:rPr>
+        <w:t xml:space="preserve">movimiento entre cuentas;</w:t>
+      </w:r>
+    </w:p>
+    <w:p>
+      <w:pPr>
+        <w:numPr>
+          <w:ilvl w:val="0"/>
+          <w:numId w:val="5"/>
+        </w:numPr>
         <w:spacing w:after="240" w:before="0" w:beforeAutospacing="0" w:lineRule="auto"/>
-        <w:ind w:left="720" w:hanging="360"/>
-      </w:pPr>
-      <w:r>
-        <w:rPr>
-          <w:rtl w:val="0"/>
-        </w:rPr>
-        <w:t xml:space="preserve">carece de ciclo de vida contractual propio.</w:t>
-      </w:r>
-    </w:p>
-    <w:p>
-      <w:pPr>
-        <w:spacing w:after="240" w:before="240" w:lineRule="auto"/>
-        <w:rPr/>
-      </w:pPr>
-      <w:r>
-        <w:rPr>
-          <w:rtl w:val="0"/>
-        </w:rPr>
-        <w:t xml:space="preserve">El conjunto completo de dichos valores constituye la totalidad del resultado publicado por Execution.</w:t>
+        <w:ind w:left="1320" w:right="600" w:hanging="360"/>
+      </w:pPr>
+      <w:r>
+        <w:rPr>
+          <w:rtl w:val="0"/>
+        </w:rPr>
+        <w:t xml:space="preserve">mecanismo de financiación.</w:t>
+      </w:r>
+    </w:p>
+    <w:p>
+      <w:pPr>
+        <w:spacing w:after="240" w:before="240" w:lineRule="auto"/>
+        <w:ind w:left="600" w:right="600" w:firstLine="0"/>
+        <w:rPr/>
+      </w:pPr>
+      <w:r>
+        <w:rPr>
+          <w:rtl w:val="0"/>
+        </w:rPr>
+        <w:t xml:space="preserve">Las transformaciones monetarias permanecen como parte de la </w:t>
+      </w:r>
+      <w:r>
+        <w:rPr>
+          <w:rFonts w:ascii="Roboto Mono" w:cs="Roboto Mono" w:eastAsia="Roboto Mono" w:hAnsi="Roboto Mono"/>
+          <w:color w:val="188038"/>
+          <w:rtl w:val="0"/>
+        </w:rPr>
+        <w:t xml:space="preserve">PortfolioTransition</w:t>
+      </w:r>
+      <w:r>
+        <w:rPr>
+          <w:rtl w:val="0"/>
+        </w:rPr>
+        <w:t xml:space="preserve"> de origen y participan en la preservación de su trazabilidad y coherencia contractual.</w:t>
+      </w:r>
+    </w:p>
+    <w:p>
+      <w:pPr>
+        <w:spacing w:after="240" w:before="240" w:lineRule="auto"/>
+        <w:ind w:left="600" w:right="600" w:firstLine="0"/>
+        <w:rPr/>
+      </w:pPr>
+      <w:r>
+        <w:rPr>
+          <w:rtl w:val="0"/>
+        </w:rPr>
+        <w:t xml:space="preserve">Cualquier futura semántica operacional autónoma para una transformación monetaria requerirá autorización arquitectónica previa.</w:t>
+      </w:r>
+    </w:p>
+    <w:p>
+      <w:pPr>
+        <w:spacing w:after="240" w:before="240" w:lineRule="auto"/>
+        <w:rPr/>
+      </w:pPr>
+      <w:r>
+        <w:rPr>
+          <w:rtl w:val="0"/>
+        </w:rPr>
       </w:r>
     </w:p>
     <w:p>
@@ -1607,8 +2254,8 @@
           <w:szCs w:val="46"/>
         </w:rPr>
       </w:pPr>
-      <w:bookmarkStart w:colFirst="0" w:colLast="0" w:name="_udf6k3bl19i7" w:id="8"/>
-      <w:bookmarkEnd w:id="8"/>
+      <w:bookmarkStart w:colFirst="0" w:colLast="0" w:name="_udf6k3bl19i7" w:id="10"/>
+      <w:bookmarkEnd w:id="10"/>
       <w:r>
         <w:rPr>
           <w:b w:val="1"/>
@@ -1641,18 +2288,6 @@
         <w:rPr>
           <w:rtl w:val="0"/>
         </w:rPr>
-        <w:t xml:space="preserve">Dicho contrato representa completamente el resultado de la responsabilidad de la Capability Execution.</w:t>
-      </w:r>
-    </w:p>
-    <w:p>
-      <w:pPr>
-        <w:spacing w:after="240" w:before="240" w:lineRule="auto"/>
-        <w:rPr/>
-      </w:pPr>
-      <w:r>
-        <w:rPr>
-          <w:rtl w:val="0"/>
-        </w:rPr>
         <w:t xml:space="preserve">El contrato constituye la única salida pública autorizada de la Capability.</w:t>
       </w:r>
     </w:p>
@@ -1665,7 +2300,44 @@
         <w:rPr>
           <w:rtl w:val="0"/>
         </w:rPr>
-        <w:t xml:space="preserve">Ningún otro contrato público podrá representar el mismo hecho del dominio.</w:t>
+        <w:t xml:space="preserve">El único contrato público principal publicado por Execution es </w:t>
+      </w:r>
+      <w:r>
+        <w:rPr>
+          <w:b w:val="1"/>
+          <w:bCs w:val="1"/>
+          <w:rtl w:val="0"/>
+        </w:rPr>
+        <w:t xml:space="preserve">OperationalIntent</w:t>
+      </w:r>
+      <w:r>
+        <w:rPr>
+          <w:rtl w:val="0"/>
+        </w:rPr>
+        <w:t xml:space="preserve">.</w:t>
+      </w:r>
+    </w:p>
+    <w:p>
+      <w:pPr>
+        <w:spacing w:after="240" w:before="240" w:lineRule="auto"/>
+        <w:rPr/>
+      </w:pPr>
+      <w:r>
+        <w:rPr>
+          <w:rtl w:val="0"/>
+        </w:rPr>
+        <w:t xml:space="preserve">Ningún otro activo contractual podrá representar el mismo resultado arquitectónico dentro del presente incremento.</w:t>
+      </w:r>
+    </w:p>
+    <w:p>
+      <w:pPr>
+        <w:spacing w:after="240" w:before="240" w:lineRule="auto"/>
+        <w:rPr/>
+      </w:pPr>
+      <w:r>
+        <w:rPr>
+          <w:rtl w:val="0"/>
+        </w:rPr>
       </w:r>
     </w:p>
     <w:p>
@@ -1696,8 +2368,8 @@
           <w:szCs w:val="46"/>
         </w:rPr>
       </w:pPr>
-      <w:bookmarkStart w:colFirst="0" w:colLast="0" w:name="_9490nlygo9nk" w:id="9"/>
-      <w:bookmarkEnd w:id="9"/>
+      <w:bookmarkStart w:colFirst="0" w:colLast="0" w:name="_9490nlygo9nk" w:id="11"/>
+      <w:bookmarkEnd w:id="11"/>
       <w:r>
         <w:rPr>
           <w:b w:val="1"/>
@@ -1718,95 +2390,59 @@
         <w:rPr>
           <w:rtl w:val="0"/>
         </w:rPr>
-        <w:t xml:space="preserve">El contrato público estará constituido exclusivamente por valores del dominio que representen operaciones individuales necesarias para materializar la transición recibida.</w:t>
-      </w:r>
-    </w:p>
-    <w:p>
-      <w:pPr>
-        <w:spacing w:after="240" w:before="240" w:lineRule="auto"/>
-        <w:rPr/>
-      </w:pPr>
-      <w:r>
-        <w:rPr>
-          <w:rtl w:val="0"/>
-        </w:rPr>
-        <w:t xml:space="preserve">Cada componente constitutivo:</w:t>
-      </w:r>
-    </w:p>
-    <w:p>
-      <w:pPr>
-        <w:numPr>
-          <w:ilvl w:val="0"/>
-          <w:numId w:val="4"/>
-        </w:numPr>
-        <w:spacing w:after="0" w:afterAutospacing="0" w:before="240" w:lineRule="auto"/>
-        <w:ind w:left="720" w:hanging="360"/>
-      </w:pPr>
-      <w:r>
-        <w:rPr>
-          <w:rtl w:val="0"/>
-        </w:rPr>
-        <w:t xml:space="preserve">representa exactamente una operación del dominio;</w:t>
-      </w:r>
-    </w:p>
-    <w:p>
-      <w:pPr>
-        <w:numPr>
-          <w:ilvl w:val="0"/>
-          <w:numId w:val="4"/>
-        </w:numPr>
-        <w:spacing w:after="0" w:afterAutospacing="0" w:before="0" w:beforeAutospacing="0" w:lineRule="auto"/>
-        <w:ind w:left="720" w:hanging="360"/>
-      </w:pPr>
-      <w:r>
-        <w:rPr>
-          <w:rtl w:val="0"/>
-        </w:rPr>
-        <w:t xml:space="preserve">pertenece exclusivamente a un único contrato principal;</w:t>
-      </w:r>
-    </w:p>
-    <w:p>
-      <w:pPr>
-        <w:numPr>
-          <w:ilvl w:val="0"/>
-          <w:numId w:val="4"/>
-        </w:numPr>
-        <w:spacing w:after="0" w:afterAutospacing="0" w:before="0" w:beforeAutospacing="0" w:lineRule="auto"/>
-        <w:ind w:left="720" w:hanging="360"/>
-      </w:pPr>
-      <w:r>
-        <w:rPr>
-          <w:rtl w:val="0"/>
-        </w:rPr>
-        <w:t xml:space="preserve">no podrá existir públicamente desvinculado del contrato que lo contiene;</w:t>
-      </w:r>
-    </w:p>
-    <w:p>
-      <w:pPr>
-        <w:numPr>
-          <w:ilvl w:val="0"/>
-          <w:numId w:val="4"/>
-        </w:numPr>
-        <w:spacing w:after="240" w:before="0" w:beforeAutospacing="0" w:lineRule="auto"/>
-        <w:ind w:left="720" w:hanging="360"/>
-      </w:pPr>
-      <w:r>
-        <w:rPr>
-          <w:rtl w:val="0"/>
-        </w:rPr>
-        <w:t xml:space="preserve">no constituye una nueva responsabilidad arquitectónica.</w:t>
-      </w:r>
-    </w:p>
-    <w:p>
-      <w:pPr>
-        <w:spacing w:after="240" w:before="240" w:lineRule="auto"/>
-        <w:rPr/>
-      </w:pPr>
-      <w:r>
-        <w:rPr>
-          <w:rtl w:val="0"/>
-        </w:rPr>
-        <w:t xml:space="preserve">La totalidad de los componentes constituye la representación completa del resultado publicado por Execution.</w:t>
+        <w:t xml:space="preserve">Los componentes públicos constitutivos de </w:t>
+      </w:r>
+      <w:r>
+        <w:rPr>
+          <w:rFonts w:ascii="Roboto Mono" w:cs="Roboto Mono" w:eastAsia="Roboto Mono" w:hAnsi="Roboto Mono"/>
+          <w:color w:val="188038"/>
+          <w:rtl w:val="0"/>
+        </w:rPr>
+        <w:t xml:space="preserve">OperationalIntent</w:t>
+      </w:r>
+      <w:r>
+        <w:rPr>
+          <w:rtl w:val="0"/>
+        </w:rPr>
+        <w:t xml:space="preserve"> son valores </w:t>
+      </w:r>
+      <w:r>
+        <w:rPr>
+          <w:rFonts w:ascii="Roboto Mono" w:cs="Roboto Mono" w:eastAsia="Roboto Mono" w:hAnsi="Roboto Mono"/>
+          <w:color w:val="188038"/>
+          <w:rtl w:val="0"/>
+        </w:rPr>
+        <w:t xml:space="preserve">InvestmentOperation</w:t>
+      </w:r>
+      <w:r>
+        <w:rPr>
+          <w:rtl w:val="0"/>
+        </w:rPr>
+        <w:t xml:space="preserve">.</w:t>
+      </w:r>
+    </w:p>
+    <w:p>
+      <w:pPr>
+        <w:spacing w:after="240" w:before="240" w:lineRule="auto"/>
+        <w:rPr/>
+      </w:pPr>
+      <w:r>
+        <w:rPr>
+          <w:rtl w:val="0"/>
+        </w:rPr>
+        <w:t xml:space="preserve">Cada uno representa exactamente una operación de inversión autorizada por la semántica definida en esta especificación.</w:t>
+      </w:r>
+    </w:p>
+    <w:p>
+      <w:pPr>
+        <w:spacing w:after="240" w:before="240" w:lineRule="auto"/>
+        <w:rPr/>
+      </w:pPr>
+      <w:r>
+        <w:rPr>
+          <w:rtl w:val="0"/>
+        </w:rPr>
+        <w:t xml:space="preserve">La totalidad de dichas operaciones constituye la representación operacional publicada por Execution.</w:t>
       </w:r>
     </w:p>
     <w:p>
@@ -1837,8 +2473,8 @@
           <w:szCs w:val="46"/>
         </w:rPr>
       </w:pPr>
-      <w:bookmarkStart w:colFirst="0" w:colLast="0" w:name="_kbgvo3sr5es3" w:id="10"/>
-      <w:bookmarkEnd w:id="10"/>
+      <w:bookmarkStart w:colFirst="0" w:colLast="0" w:name="_kbgvo3sr5es3" w:id="12"/>
+      <w:bookmarkEnd w:id="12"/>
       <w:r>
         <w:rPr>
           <w:b w:val="1"/>
@@ -1878,7 +2514,7 @@
       <w:pPr>
         <w:numPr>
           <w:ilvl w:val="0"/>
-          <w:numId w:val="15"/>
+          <w:numId w:val="19"/>
         </w:numPr>
         <w:spacing w:after="0" w:afterAutospacing="0" w:before="240" w:lineRule="auto"/>
         <w:ind w:left="720" w:hanging="360"/>
@@ -1894,7 +2530,7 @@
       <w:pPr>
         <w:numPr>
           <w:ilvl w:val="0"/>
-          <w:numId w:val="15"/>
+          <w:numId w:val="19"/>
         </w:numPr>
         <w:spacing w:after="0" w:afterAutospacing="0" w:before="0" w:beforeAutospacing="0" w:lineRule="auto"/>
         <w:ind w:left="720" w:hanging="360"/>
@@ -1910,7 +2546,7 @@
       <w:pPr>
         <w:numPr>
           <w:ilvl w:val="0"/>
-          <w:numId w:val="15"/>
+          <w:numId w:val="19"/>
         </w:numPr>
         <w:spacing w:after="240" w:before="0" w:beforeAutospacing="0" w:lineRule="auto"/>
         <w:ind w:left="720" w:hanging="360"/>
@@ -1932,6 +2568,86 @@
           <w:rtl w:val="0"/>
         </w:rPr>
         <w:t xml:space="preserve">Execution no publicará contratos cuyo origen no pueda asociarse inequívocamente a una PortfolioTransition.</w:t>
+      </w:r>
+    </w:p>
+    <w:p>
+      <w:pPr>
+        <w:spacing w:after="240" w:before="240" w:lineRule="auto"/>
+        <w:rPr/>
+      </w:pPr>
+      <w:r>
+        <w:rPr>
+          <w:rtl w:val="0"/>
+        </w:rPr>
+      </w:r>
+    </w:p>
+    <w:p>
+      <w:pPr>
+        <w:spacing w:after="240" w:before="240" w:lineRule="auto"/>
+        <w:rPr/>
+      </w:pPr>
+      <w:r>
+        <w:rPr>
+          <w:rFonts w:ascii="Roboto Mono" w:cs="Roboto Mono" w:eastAsia="Roboto Mono" w:hAnsi="Roboto Mono"/>
+          <w:color w:val="188038"/>
+          <w:rtl w:val="0"/>
+        </w:rPr>
+        <w:t xml:space="preserve">OperationalIntent</w:t>
+      </w:r>
+      <w:r>
+        <w:rPr>
+          <w:rtl w:val="0"/>
+        </w:rPr>
+        <w:t xml:space="preserve"> preservará públicamente su relación con una única </w:t>
+      </w:r>
+      <w:r>
+        <w:rPr>
+          <w:rFonts w:ascii="Roboto Mono" w:cs="Roboto Mono" w:eastAsia="Roboto Mono" w:hAnsi="Roboto Mono"/>
+          <w:color w:val="188038"/>
+          <w:rtl w:val="0"/>
+        </w:rPr>
+        <w:t xml:space="preserve">PortfolioTransition</w:t>
+      </w:r>
+      <w:r>
+        <w:rPr>
+          <w:rtl w:val="0"/>
+        </w:rPr>
+        <w:t xml:space="preserve">.</w:t>
+      </w:r>
+    </w:p>
+    <w:p>
+      <w:pPr>
+        <w:spacing w:after="240" w:before="240" w:lineRule="auto"/>
+        <w:rPr/>
+      </w:pPr>
+      <w:r>
+        <w:rPr>
+          <w:rtl w:val="0"/>
+        </w:rPr>
+        <w:t xml:space="preserve">Las operaciones constitutivas deberán corresponder exclusivamente a las transformaciones de posición materializables contenidas en dicha transición.</w:t>
+      </w:r>
+    </w:p>
+    <w:p>
+      <w:pPr>
+        <w:spacing w:after="240" w:before="240" w:lineRule="auto"/>
+        <w:rPr/>
+      </w:pPr>
+      <w:r>
+        <w:rPr>
+          <w:rtl w:val="0"/>
+        </w:rPr>
+        <w:t xml:space="preserve">Execution no inventará operaciones sin respaldo semántico en la transición recibida.</w:t>
+      </w:r>
+    </w:p>
+    <w:p>
+      <w:pPr>
+        <w:spacing w:after="240" w:before="240" w:lineRule="auto"/>
+        <w:rPr/>
+      </w:pPr>
+      <w:r>
+        <w:rPr>
+          <w:rtl w:val="0"/>
+        </w:rPr>
       </w:r>
     </w:p>
     <w:p>
@@ -1962,8 +2678,8 @@
           <w:szCs w:val="46"/>
         </w:rPr>
       </w:pPr>
-      <w:bookmarkStart w:colFirst="0" w:colLast="0" w:name="_gfmcxkpqy6j3" w:id="11"/>
-      <w:bookmarkEnd w:id="11"/>
+      <w:bookmarkStart w:colFirst="0" w:colLast="0" w:name="_gfmcxkpqy6j3" w:id="13"/>
+      <w:bookmarkEnd w:id="13"/>
       <w:r>
         <w:rPr>
           <w:b w:val="1"/>
@@ -1984,7 +2700,26 @@
         <w:rPr>
           <w:rtl w:val="0"/>
         </w:rPr>
-        <w:t xml:space="preserve">El contrato publicado deberá representar completamente la transición consumida.</w:t>
+        <w:t xml:space="preserve">El contrato publicado deberá representar completamente la dimensión operacional materializable de la </w:t>
+      </w:r>
+      <w:r>
+        <w:rPr>
+          <w:rFonts w:ascii="Roboto Mono" w:cs="Roboto Mono" w:eastAsia="Roboto Mono" w:hAnsi="Roboto Mono"/>
+          <w:color w:val="188038"/>
+          <w:rtl w:val="0"/>
+        </w:rPr>
+        <w:t xml:space="preserve">PortfolioTransition</w:t>
+      </w:r>
+      <w:r>
+        <w:rPr>
+          <w:rtl w:val="0"/>
+        </w:rPr>
+        <w:t xml:space="preserve"> consumida conforme a la semántica autorizada por esta especificación. </w:t>
+      </w:r>
+      <w:r>
+        <w:rPr>
+          <w:rtl w:val="0"/>
+        </w:rPr>
       </w:r>
     </w:p>
     <w:p>
@@ -2008,7 +2743,176 @@
         <w:rPr>
           <w:rtl w:val="0"/>
         </w:rPr>
-        <w:t xml:space="preserve">La publicación del contrato implica que la determinación operacional correspondiente ha finalizado completamente dentro de la Capability.</w:t>
+        <w:t xml:space="preserve">Un </w:t>
+      </w:r>
+      <w:r>
+        <w:rPr>
+          <w:rFonts w:ascii="Roboto Mono" w:cs="Roboto Mono" w:eastAsia="Roboto Mono" w:hAnsi="Roboto Mono"/>
+          <w:color w:val="188038"/>
+          <w:rtl w:val="0"/>
+        </w:rPr>
+        <w:t xml:space="preserve">OperationalIntent</w:t>
+      </w:r>
+      <w:r>
+        <w:rPr>
+          <w:rtl w:val="0"/>
+        </w:rPr>
+        <w:t xml:space="preserve"> será contractualmente completo cuando:</w:t>
+      </w:r>
+    </w:p>
+    <w:p>
+      <w:pPr>
+        <w:numPr>
+          <w:ilvl w:val="0"/>
+          <w:numId w:val="8"/>
+        </w:numPr>
+        <w:spacing w:after="0" w:afterAutospacing="0" w:before="240" w:lineRule="auto"/>
+        <w:ind w:left="720" w:hanging="360"/>
+      </w:pPr>
+      <w:r>
+        <w:rPr>
+          <w:rtl w:val="0"/>
+        </w:rPr>
+        <w:t xml:space="preserve">cada </w:t>
+      </w:r>
+      <w:r>
+        <w:rPr>
+          <w:rFonts w:ascii="Roboto Mono" w:cs="Roboto Mono" w:eastAsia="Roboto Mono" w:hAnsi="Roboto Mono"/>
+          <w:color w:val="188038"/>
+          <w:rtl w:val="0"/>
+        </w:rPr>
+        <w:t xml:space="preserve">PortfolioPositionTransition</w:t>
+      </w:r>
+      <w:r>
+        <w:rPr>
+          <w:rtl w:val="0"/>
+        </w:rPr>
+        <w:t xml:space="preserve"> material de su </w:t>
+      </w:r>
+      <w:r>
+        <w:rPr>
+          <w:rFonts w:ascii="Roboto Mono" w:cs="Roboto Mono" w:eastAsia="Roboto Mono" w:hAnsi="Roboto Mono"/>
+          <w:color w:val="188038"/>
+          <w:rtl w:val="0"/>
+        </w:rPr>
+        <w:t xml:space="preserve">PortfolioTransition</w:t>
+      </w:r>
+      <w:r>
+        <w:rPr>
+          <w:rtl w:val="0"/>
+        </w:rPr>
+        <w:t xml:space="preserve"> de origen esté representada por exactamente una </w:t>
+      </w:r>
+      <w:r>
+        <w:rPr>
+          <w:rFonts w:ascii="Roboto Mono" w:cs="Roboto Mono" w:eastAsia="Roboto Mono" w:hAnsi="Roboto Mono"/>
+          <w:color w:val="188038"/>
+          <w:rtl w:val="0"/>
+        </w:rPr>
+        <w:t xml:space="preserve">InvestmentOperation</w:t>
+      </w:r>
+      <w:r>
+        <w:rPr>
+          <w:rtl w:val="0"/>
+        </w:rPr>
+        <w:t xml:space="preserve">;</w:t>
+      </w:r>
+    </w:p>
+    <w:p>
+      <w:pPr>
+        <w:numPr>
+          <w:ilvl w:val="0"/>
+          <w:numId w:val="8"/>
+        </w:numPr>
+        <w:spacing w:after="0" w:afterAutospacing="0" w:before="0" w:beforeAutospacing="0" w:lineRule="auto"/>
+        <w:ind w:left="720" w:hanging="360"/>
+      </w:pPr>
+      <w:r>
+        <w:rPr>
+          <w:rtl w:val="0"/>
+        </w:rPr>
+        <w:t xml:space="preserve">no exista ninguna </w:t>
+      </w:r>
+      <w:r>
+        <w:rPr>
+          <w:rFonts w:ascii="Roboto Mono" w:cs="Roboto Mono" w:eastAsia="Roboto Mono" w:hAnsi="Roboto Mono"/>
+          <w:color w:val="188038"/>
+          <w:rtl w:val="0"/>
+        </w:rPr>
+        <w:t xml:space="preserve">InvestmentOperation</w:t>
+      </w:r>
+      <w:r>
+        <w:rPr>
+          <w:rtl w:val="0"/>
+        </w:rPr>
+        <w:t xml:space="preserve"> sin correspondencia con una </w:t>
+      </w:r>
+      <w:r>
+        <w:rPr>
+          <w:rFonts w:ascii="Roboto Mono" w:cs="Roboto Mono" w:eastAsia="Roboto Mono" w:hAnsi="Roboto Mono"/>
+          <w:color w:val="188038"/>
+          <w:rtl w:val="0"/>
+        </w:rPr>
+        <w:t xml:space="preserve">PortfolioPositionTransition</w:t>
+      </w:r>
+      <w:r>
+        <w:rPr>
+          <w:rtl w:val="0"/>
+        </w:rPr>
+        <w:t xml:space="preserve">;</w:t>
+      </w:r>
+    </w:p>
+    <w:p>
+      <w:pPr>
+        <w:numPr>
+          <w:ilvl w:val="0"/>
+          <w:numId w:val="8"/>
+        </w:numPr>
+        <w:spacing w:after="240" w:before="0" w:beforeAutospacing="0" w:lineRule="auto"/>
+        <w:ind w:left="720" w:hanging="360"/>
+      </w:pPr>
+      <w:r>
+        <w:rPr>
+          <w:rtl w:val="0"/>
+        </w:rPr>
+        <w:t xml:space="preserve">instrumento, dirección y magnitud operacional sean coherentes con la transformación de posición correspondiente.</w:t>
+      </w:r>
+    </w:p>
+    <w:p>
+      <w:pPr>
+        <w:spacing w:after="240" w:before="240" w:lineRule="auto"/>
+        <w:rPr/>
+      </w:pPr>
+      <w:r>
+        <w:rPr>
+          <w:rtl w:val="0"/>
+        </w:rPr>
+        <w:t xml:space="preserve">Las </w:t>
+      </w:r>
+      <w:r>
+        <w:rPr>
+          <w:rFonts w:ascii="Roboto Mono" w:cs="Roboto Mono" w:eastAsia="Roboto Mono" w:hAnsi="Roboto Mono"/>
+          <w:color w:val="188038"/>
+          <w:rtl w:val="0"/>
+        </w:rPr>
+        <w:t xml:space="preserve">PortfolioMonetaryTransition</w:t>
+      </w:r>
+      <w:r>
+        <w:rPr>
+          <w:rtl w:val="0"/>
+        </w:rPr>
+        <w:t xml:space="preserve"> no generan operaciones autónomas dentro del presente incremento y, por tanto, no forman parte de este criterio de correspondencia operacional.</w:t>
+      </w:r>
+    </w:p>
+    <w:p>
+      <w:pPr>
+        <w:spacing w:after="240" w:before="240" w:lineRule="auto"/>
+        <w:rPr/>
+      </w:pPr>
+      <w:r>
+        <w:rPr>
+          <w:rtl w:val="0"/>
+        </w:rPr>
       </w:r>
     </w:p>
     <w:p>
@@ -2051,8 +2955,8 @@
           <w:szCs w:val="46"/>
         </w:rPr>
       </w:pPr>
-      <w:bookmarkStart w:colFirst="0" w:colLast="0" w:name="_jg8fo1icdzml" w:id="12"/>
-      <w:bookmarkEnd w:id="12"/>
+      <w:bookmarkStart w:colFirst="0" w:colLast="0" w:name="_jg8fo1icdzml" w:id="14"/>
+      <w:bookmarkEnd w:id="14"/>
       <w:r>
         <w:rPr>
           <w:b w:val="1"/>
@@ -2080,7 +2984,7 @@
       <w:pPr>
         <w:numPr>
           <w:ilvl w:val="0"/>
-          <w:numId w:val="3"/>
+          <w:numId w:val="6"/>
         </w:numPr>
         <w:spacing w:after="0" w:afterAutospacing="0" w:before="240" w:lineRule="auto"/>
         <w:ind w:left="720" w:hanging="360"/>
@@ -2096,7 +3000,7 @@
       <w:pPr>
         <w:numPr>
           <w:ilvl w:val="0"/>
-          <w:numId w:val="3"/>
+          <w:numId w:val="6"/>
         </w:numPr>
         <w:spacing w:after="0" w:afterAutospacing="0" w:before="0" w:beforeAutospacing="0" w:lineRule="auto"/>
         <w:ind w:left="720" w:hanging="360"/>
@@ -2112,7 +3016,7 @@
       <w:pPr>
         <w:numPr>
           <w:ilvl w:val="0"/>
-          <w:numId w:val="3"/>
+          <w:numId w:val="6"/>
         </w:numPr>
         <w:spacing w:after="0" w:afterAutospacing="0" w:before="0" w:beforeAutospacing="0" w:lineRule="auto"/>
         <w:ind w:left="720" w:hanging="360"/>
@@ -2128,7 +3032,7 @@
       <w:pPr>
         <w:numPr>
           <w:ilvl w:val="0"/>
-          <w:numId w:val="3"/>
+          <w:numId w:val="6"/>
         </w:numPr>
         <w:spacing w:after="0" w:afterAutospacing="0" w:before="0" w:beforeAutospacing="0" w:lineRule="auto"/>
         <w:ind w:left="720" w:hanging="360"/>
@@ -2144,7 +3048,7 @@
       <w:pPr>
         <w:numPr>
           <w:ilvl w:val="0"/>
-          <w:numId w:val="3"/>
+          <w:numId w:val="6"/>
         </w:numPr>
         <w:spacing w:after="240" w:before="0" w:beforeAutospacing="0" w:lineRule="auto"/>
         <w:ind w:left="720" w:hanging="360"/>
@@ -2154,6 +3058,108 @@
           <w:rtl w:val="0"/>
         </w:rPr>
         <w:t xml:space="preserve">la totalidad de las operaciones publicadas representa completamente la transición recibida.</w:t>
+      </w:r>
+    </w:p>
+    <w:p>
+      <w:pPr>
+        <w:spacing w:after="240" w:before="240" w:lineRule="auto"/>
+        <w:rPr/>
+      </w:pPr>
+      <w:r>
+        <w:rPr>
+          <w:rtl w:val="0"/>
+        </w:rPr>
+        <w:t xml:space="preserve">No se autoriza:</w:t>
+      </w:r>
+    </w:p>
+    <w:p>
+      <w:pPr>
+        <w:numPr>
+          <w:ilvl w:val="0"/>
+          <w:numId w:val="1"/>
+        </w:numPr>
+        <w:spacing w:after="0" w:afterAutospacing="0" w:before="240" w:lineRule="auto"/>
+        <w:ind w:left="720" w:hanging="360"/>
+      </w:pPr>
+      <w:r>
+        <w:rPr>
+          <w:rtl w:val="0"/>
+        </w:rPr>
+        <w:t xml:space="preserve">omitir una transformación de posición material;</w:t>
+      </w:r>
+    </w:p>
+    <w:p>
+      <w:pPr>
+        <w:numPr>
+          <w:ilvl w:val="0"/>
+          <w:numId w:val="1"/>
+        </w:numPr>
+        <w:spacing w:after="0" w:afterAutospacing="0" w:before="0" w:beforeAutospacing="0" w:lineRule="auto"/>
+        <w:ind w:left="720" w:hanging="360"/>
+      </w:pPr>
+      <w:r>
+        <w:rPr>
+          <w:rtl w:val="0"/>
+        </w:rPr>
+        <w:t xml:space="preserve">introducir una operación adicional sin respaldo en </w:t>
+      </w:r>
+      <w:r>
+        <w:rPr>
+          <w:rFonts w:ascii="Roboto Mono" w:cs="Roboto Mono" w:eastAsia="Roboto Mono" w:hAnsi="Roboto Mono"/>
+          <w:color w:val="188038"/>
+          <w:rtl w:val="0"/>
+        </w:rPr>
+        <w:t xml:space="preserve">PortfolioTransition</w:t>
+      </w:r>
+      <w:r>
+        <w:rPr>
+          <w:rtl w:val="0"/>
+        </w:rPr>
+        <w:t xml:space="preserve">;</w:t>
+      </w:r>
+    </w:p>
+    <w:p>
+      <w:pPr>
+        <w:numPr>
+          <w:ilvl w:val="0"/>
+          <w:numId w:val="1"/>
+        </w:numPr>
+        <w:spacing w:after="0" w:afterAutospacing="0" w:before="0" w:beforeAutospacing="0" w:lineRule="auto"/>
+        <w:ind w:left="720" w:hanging="360"/>
+      </w:pPr>
+      <w:r>
+        <w:rPr>
+          <w:rtl w:val="0"/>
+        </w:rPr>
+        <w:t xml:space="preserve">invertir la dirección operacional correspondiente a una transformación;</w:t>
+      </w:r>
+    </w:p>
+    <w:p>
+      <w:pPr>
+        <w:numPr>
+          <w:ilvl w:val="0"/>
+          <w:numId w:val="1"/>
+        </w:numPr>
+        <w:spacing w:after="240" w:before="0" w:beforeAutospacing="0" w:lineRule="auto"/>
+        <w:ind w:left="720" w:hanging="360"/>
+      </w:pPr>
+      <w:r>
+        <w:rPr>
+          <w:rtl w:val="0"/>
+        </w:rPr>
+        <w:t xml:space="preserve">reinterpretar una transformación monetaria como operación autónoma sin autorización arquitectónica.</w:t>
+      </w:r>
+    </w:p>
+    <w:p>
+      <w:pPr>
+        <w:spacing w:after="240" w:before="240" w:lineRule="auto"/>
+        <w:ind w:left="0" w:firstLine="0"/>
+        <w:rPr/>
+      </w:pPr>
+      <w:r>
+        <w:rPr>
+          <w:rtl w:val="0"/>
+        </w:rPr>
       </w:r>
     </w:p>
     <w:p>
@@ -2196,8 +3202,8 @@
           <w:szCs w:val="46"/>
         </w:rPr>
       </w:pPr>
-      <w:bookmarkStart w:colFirst="0" w:colLast="0" w:name="_qcvwlkel3hsx" w:id="13"/>
-      <w:bookmarkEnd w:id="13"/>
+      <w:bookmarkStart w:colFirst="0" w:colLast="0" w:name="_qcvwlkel3hsx" w:id="15"/>
+      <w:bookmarkEnd w:id="15"/>
       <w:r>
         <w:rPr>
           <w:b w:val="1"/>
@@ -2237,7 +3243,7 @@
       <w:pPr>
         <w:numPr>
           <w:ilvl w:val="0"/>
-          <w:numId w:val="9"/>
+          <w:numId w:val="12"/>
         </w:numPr>
         <w:spacing w:after="0" w:afterAutospacing="0" w:before="240" w:lineRule="auto"/>
         <w:ind w:left="720" w:hanging="360"/>
@@ -2253,7 +3259,7 @@
       <w:pPr>
         <w:numPr>
           <w:ilvl w:val="0"/>
-          <w:numId w:val="9"/>
+          <w:numId w:val="12"/>
         </w:numPr>
         <w:spacing w:after="0" w:afterAutospacing="0" w:before="0" w:beforeAutospacing="0" w:lineRule="auto"/>
         <w:ind w:left="720" w:hanging="360"/>
@@ -2269,7 +3275,7 @@
       <w:pPr>
         <w:numPr>
           <w:ilvl w:val="0"/>
-          <w:numId w:val="9"/>
+          <w:numId w:val="12"/>
         </w:numPr>
         <w:spacing w:after="0" w:afterAutospacing="0" w:before="0" w:beforeAutospacing="0" w:lineRule="auto"/>
         <w:ind w:left="720" w:hanging="360"/>
@@ -2285,7 +3291,7 @@
       <w:pPr>
         <w:numPr>
           <w:ilvl w:val="0"/>
-          <w:numId w:val="9"/>
+          <w:numId w:val="12"/>
         </w:numPr>
         <w:spacing w:after="0" w:afterAutospacing="0" w:before="0" w:beforeAutospacing="0" w:lineRule="auto"/>
         <w:ind w:left="720" w:hanging="360"/>
@@ -2301,7 +3307,7 @@
       <w:pPr>
         <w:numPr>
           <w:ilvl w:val="0"/>
-          <w:numId w:val="9"/>
+          <w:numId w:val="12"/>
         </w:numPr>
         <w:spacing w:after="240" w:before="0" w:beforeAutospacing="0" w:lineRule="auto"/>
         <w:ind w:left="720" w:hanging="360"/>
@@ -2353,8 +3359,8 @@
           <w:szCs w:val="46"/>
         </w:rPr>
       </w:pPr>
-      <w:bookmarkStart w:colFirst="0" w:colLast="0" w:name="_q0s71apepyhb" w:id="14"/>
-      <w:bookmarkEnd w:id="14"/>
+      <w:bookmarkStart w:colFirst="0" w:colLast="0" w:name="_q0s71apepyhb" w:id="16"/>
+      <w:bookmarkEnd w:id="16"/>
       <w:r>
         <w:rPr>
           <w:b w:val="1"/>
@@ -2375,107 +3381,205 @@
         <w:rPr>
           <w:rtl w:val="0"/>
         </w:rPr>
-        <w:t xml:space="preserve">El incremento autoriza exclusivamente una jerarquía pública mínima de excepciones destinada a comunicar violaciones del contrato del dominio.</w:t>
-      </w:r>
-    </w:p>
-    <w:p>
-      <w:pPr>
-        <w:spacing w:after="240" w:before="240" w:lineRule="auto"/>
-        <w:rPr/>
-      </w:pPr>
-      <w:r>
-        <w:rPr>
-          <w:rtl w:val="0"/>
-        </w:rPr>
-        <w:t xml:space="preserve">Las excepciones públicas representan únicamente incumplimientos contractuales observables.</w:t>
-      </w:r>
-    </w:p>
-    <w:p>
-      <w:pPr>
-        <w:spacing w:after="240" w:before="240" w:lineRule="auto"/>
-        <w:rPr/>
-      </w:pPr>
-      <w:r>
-        <w:rPr>
-          <w:rtl w:val="0"/>
-        </w:rPr>
-        <w:t xml:space="preserve">No representan:</w:t>
-      </w:r>
-    </w:p>
-    <w:p>
-      <w:pPr>
-        <w:numPr>
-          <w:ilvl w:val="0"/>
-          <w:numId w:val="11"/>
+        <w:t xml:space="preserve">El incremento deberá exponer una excepción pública base asociada a violaciones contractuales de Execution.</w:t>
+      </w:r>
+    </w:p>
+    <w:p>
+      <w:pPr>
+        <w:spacing w:after="240" w:before="240" w:lineRule="auto"/>
+        <w:rPr/>
+      </w:pPr>
+      <w:r>
+        <w:rPr>
+          <w:rtl w:val="0"/>
+        </w:rPr>
+        <w:t xml:space="preserve">Las categorías internas adicionales de error y su organización pertenecen al Agente de Implementación mientras no introduzcan nueva semántica pública ni modifiquen los criterios contractuales establecidos por esta especificación.</w:t>
+      </w:r>
+    </w:p>
+    <w:p>
+      <w:pPr>
+        <w:spacing w:after="240" w:before="240" w:lineRule="auto"/>
+        <w:rPr/>
+      </w:pPr>
+      <w:r>
+        <w:rPr>
+          <w:rtl w:val="0"/>
+        </w:rPr>
+      </w:r>
+    </w:p>
+    <w:p>
+      <w:pPr>
+        <w:pStyle w:val="Heading2"/>
+        <w:keepNext w:val="0"/>
+        <w:keepLines w:val="0"/>
+        <w:spacing w:after="80" w:lineRule="auto"/>
+        <w:rPr>
+          <w:b w:val="1"/>
+          <w:bCs w:val="1"/>
+          <w:sz w:val="34"/>
+          <w:szCs w:val="34"/>
+        </w:rPr>
+      </w:pPr>
+      <w:bookmarkStart w:colFirst="0" w:colLast="0" w:name="_108y2cfzgdw2" w:id="17"/>
+      <w:bookmarkEnd w:id="17"/>
+      <w:r>
+        <w:rPr>
+          <w:b w:val="1"/>
+          <w:bCs w:val="1"/>
+          <w:sz w:val="34"/>
+          <w:szCs w:val="34"/>
+          <w:rtl w:val="0"/>
+        </w:rPr>
+        <w:t xml:space="preserve">14.1 — API pública mínima</w:t>
+      </w:r>
+    </w:p>
+    <w:p>
+      <w:pPr>
+        <w:spacing w:after="240" w:before="240" w:lineRule="auto"/>
+        <w:ind w:left="600" w:right="600" w:firstLine="0"/>
+        <w:rPr/>
+      </w:pPr>
+      <w:r>
+        <w:rPr>
+          <w:rtl w:val="0"/>
+        </w:rPr>
+        <w:t xml:space="preserve">La API pública mínima autorizada por IT-034-001 deberá permitir consumir:</w:t>
+      </w:r>
+    </w:p>
+    <w:p>
+      <w:pPr>
+        <w:numPr>
+          <w:ilvl w:val="0"/>
+          <w:numId w:val="2"/>
         </w:numPr>
         <w:spacing w:after="0" w:afterAutospacing="0" w:before="240" w:lineRule="auto"/>
-        <w:ind w:left="720" w:hanging="360"/>
-      </w:pPr>
-      <w:r>
-        <w:rPr>
-          <w:rtl w:val="0"/>
-        </w:rPr>
-        <w:t xml:space="preserve">errores de infraestructura;</w:t>
-      </w:r>
-    </w:p>
-    <w:p>
-      <w:pPr>
-        <w:numPr>
-          <w:ilvl w:val="0"/>
-          <w:numId w:val="11"/>
+        <w:ind w:left="1320" w:right="600" w:hanging="360"/>
+      </w:pPr>
+      <w:r>
+        <w:rPr>
+          <w:rFonts w:ascii="Roboto Mono" w:cs="Roboto Mono" w:eastAsia="Roboto Mono" w:hAnsi="Roboto Mono"/>
+          <w:color w:val="188038"/>
+          <w:rtl w:val="0"/>
+        </w:rPr>
+        <w:t xml:space="preserve">OperationalIntent</w:t>
+      </w:r>
+      <w:r>
+        <w:rPr>
+          <w:rtl w:val="0"/>
+        </w:rPr>
+        <w:t xml:space="preserve">;</w:t>
+      </w:r>
+    </w:p>
+    <w:p>
+      <w:pPr>
+        <w:numPr>
+          <w:ilvl w:val="0"/>
+          <w:numId w:val="2"/>
         </w:numPr>
         <w:spacing w:after="0" w:afterAutospacing="0" w:before="0" w:beforeAutospacing="0" w:lineRule="auto"/>
-        <w:ind w:left="720" w:hanging="360"/>
-      </w:pPr>
-      <w:r>
-        <w:rPr>
-          <w:rtl w:val="0"/>
-        </w:rPr>
-        <w:t xml:space="preserve">errores de comunicación;</w:t>
-      </w:r>
-    </w:p>
-    <w:p>
-      <w:pPr>
-        <w:numPr>
-          <w:ilvl w:val="0"/>
-          <w:numId w:val="11"/>
+        <w:ind w:left="1320" w:right="600" w:hanging="360"/>
+      </w:pPr>
+      <w:r>
+        <w:rPr>
+          <w:rFonts w:ascii="Roboto Mono" w:cs="Roboto Mono" w:eastAsia="Roboto Mono" w:hAnsi="Roboto Mono"/>
+          <w:color w:val="188038"/>
+          <w:rtl w:val="0"/>
+        </w:rPr>
+        <w:t xml:space="preserve">InvestmentOperation</w:t>
+      </w:r>
+      <w:r>
+        <w:rPr>
+          <w:rtl w:val="0"/>
+        </w:rPr>
+        <w:t xml:space="preserve">;</w:t>
+      </w:r>
+    </w:p>
+    <w:p>
+      <w:pPr>
+        <w:numPr>
+          <w:ilvl w:val="0"/>
+          <w:numId w:val="2"/>
         </w:numPr>
         <w:spacing w:after="0" w:afterAutospacing="0" w:before="0" w:beforeAutospacing="0" w:lineRule="auto"/>
-        <w:ind w:left="720" w:hanging="360"/>
-      </w:pPr>
-      <w:r>
-        <w:rPr>
-          <w:rtl w:val="0"/>
-        </w:rPr>
-        <w:t xml:space="preserve">errores del broker;</w:t>
-      </w:r>
-    </w:p>
-    <w:p>
-      <w:pPr>
-        <w:numPr>
-          <w:ilvl w:val="0"/>
-          <w:numId w:val="11"/>
+        <w:ind w:left="1320" w:right="600" w:hanging="360"/>
+      </w:pPr>
+      <w:r>
+        <w:rPr>
+          <w:rtl w:val="0"/>
+        </w:rPr>
+        <w:t xml:space="preserve">la semántica operacional </w:t>
+      </w:r>
+      <w:r>
+        <w:rPr>
+          <w:rFonts w:ascii="Roboto Mono" w:cs="Roboto Mono" w:eastAsia="Roboto Mono" w:hAnsi="Roboto Mono"/>
+          <w:color w:val="188038"/>
+          <w:rtl w:val="0"/>
+        </w:rPr>
+        <w:t xml:space="preserve">BUY | SELL</w:t>
+      </w:r>
+      <w:r>
+        <w:rPr>
+          <w:rtl w:val="0"/>
+        </w:rPr>
+        <w:t xml:space="preserve">;</w:t>
+      </w:r>
+    </w:p>
+    <w:p>
+      <w:pPr>
+        <w:numPr>
+          <w:ilvl w:val="0"/>
+          <w:numId w:val="2"/>
         </w:numPr>
         <w:spacing w:after="240" w:before="0" w:beforeAutospacing="0" w:lineRule="auto"/>
-        <w:ind w:left="720" w:hanging="360"/>
-      </w:pPr>
-      <w:r>
-        <w:rPr>
-          <w:rtl w:val="0"/>
-        </w:rPr>
-        <w:t xml:space="preserve">errores internos de implementación.</w:t>
-      </w:r>
-    </w:p>
-    <w:p>
-      <w:pPr>
-        <w:spacing w:after="240" w:before="240" w:lineRule="auto"/>
-        <w:rPr/>
-      </w:pPr>
-      <w:r>
-        <w:rPr>
-          <w:rtl w:val="0"/>
-        </w:rPr>
-        <w:t xml:space="preserve">La organización interna de la jerarquía y su implementación concreta pertenecen al Agente de Implementación, siempre que preserve la semántica pública definida por esta especificación.</w:t>
+        <w:ind w:left="1320" w:right="600" w:hanging="360"/>
+      </w:pPr>
+      <w:r>
+        <w:rPr>
+          <w:rtl w:val="0"/>
+        </w:rPr>
+        <w:t xml:space="preserve">la excepción pública base de dominio de Execution.</w:t>
+      </w:r>
+    </w:p>
+    <w:p>
+      <w:pPr>
+        <w:spacing w:after="240" w:before="240" w:lineRule="auto"/>
+        <w:ind w:left="600" w:right="600" w:firstLine="0"/>
+        <w:rPr/>
+      </w:pPr>
+      <w:r>
+        <w:rPr>
+          <w:rtl w:val="0"/>
+        </w:rPr>
+        <w:t xml:space="preserve">No se autorizan activos contractuales públicos adicionales dentro del presente incremento.</w:t>
+      </w:r>
+    </w:p>
+    <w:p>
+      <w:pPr>
+        <w:spacing w:after="240" w:before="240" w:lineRule="auto"/>
+        <w:ind w:left="600" w:right="600" w:firstLine="0"/>
+        <w:rPr/>
+      </w:pPr>
+      <w:r>
+        <w:rPr>
+          <w:rtl w:val="0"/>
+        </w:rPr>
+        <w:t xml:space="preserve">La representación técnica concreta de estos conceptos pertenece al Agente de Implementación siempre que preserve exactamente la semántica definida.</w:t>
+      </w:r>
+    </w:p>
+    <w:p>
+      <w:pPr>
+        <w:spacing w:after="240" w:before="240" w:lineRule="auto"/>
+        <w:rPr/>
+      </w:pPr>
+      <w:r>
+        <w:pict>
+          <v:rect style="width:0.0pt;height:1.5pt" o:hr="t" o:hrstd="t" o:hralign="center" fillcolor="#A0A0A0" stroked="f"/>
+        </w:pict>
+      </w:r>
+      <w:r>
+        <w:rPr>
+          <w:rtl w:val="0"/>
+        </w:rPr>
       </w:r>
     </w:p>
     <w:p>
@@ -2491,8 +3595,8 @@
           <w:szCs w:val="46"/>
         </w:rPr>
       </w:pPr>
-      <w:bookmarkStart w:colFirst="0" w:colLast="0" w:name="_bdl5sywjtz7g" w:id="15"/>
-      <w:bookmarkEnd w:id="15"/>
+      <w:bookmarkStart w:colFirst="0" w:colLast="0" w:name="_bdl5sywjtz7g" w:id="18"/>
+      <w:bookmarkEnd w:id="18"/>
       <w:r>
         <w:rPr>
           <w:b w:val="1"/>
@@ -2529,8 +3633,8 @@
           <w:szCs w:val="34"/>
         </w:rPr>
       </w:pPr>
-      <w:bookmarkStart w:colFirst="0" w:colLast="0" w:name="_h0km4zirmppg" w:id="16"/>
-      <w:bookmarkEnd w:id="16"/>
+      <w:bookmarkStart w:colFirst="0" w:colLast="0" w:name="_h0km4zirmppg" w:id="19"/>
+      <w:bookmarkEnd w:id="19"/>
       <w:r>
         <w:rPr>
           <w:b w:val="1"/>
@@ -2594,8 +3698,8 @@
           <w:szCs w:val="34"/>
         </w:rPr>
       </w:pPr>
-      <w:bookmarkStart w:colFirst="0" w:colLast="0" w:name="_qefx9yii5861" w:id="17"/>
-      <w:bookmarkEnd w:id="17"/>
+      <w:bookmarkStart w:colFirst="0" w:colLast="0" w:name="_qefx9yii5861" w:id="20"/>
+      <w:bookmarkEnd w:id="20"/>
       <w:r>
         <w:rPr>
           <w:b w:val="1"/>
@@ -2673,8 +3777,8 @@
           <w:szCs w:val="34"/>
         </w:rPr>
       </w:pPr>
-      <w:bookmarkStart w:colFirst="0" w:colLast="0" w:name="_d72k2hwovsx8" w:id="18"/>
-      <w:bookmarkEnd w:id="18"/>
+      <w:bookmarkStart w:colFirst="0" w:colLast="0" w:name="_d72k2hwovsx8" w:id="21"/>
+      <w:bookmarkEnd w:id="21"/>
       <w:r>
         <w:rPr>
           <w:b w:val="1"/>
@@ -2695,19 +3799,72 @@
         <w:rPr>
           <w:rtl w:val="0"/>
         </w:rPr>
-        <w:t xml:space="preserve">El conjunto de operaciones representado por el contrato deberá constituir la totalidad de las operaciones necesarias para materializar la transición consumida.</w:t>
-      </w:r>
-    </w:p>
-    <w:p>
-      <w:pPr>
-        <w:spacing w:after="240" w:before="240" w:lineRule="auto"/>
-        <w:rPr/>
-      </w:pPr>
-      <w:r>
-        <w:rPr>
-          <w:rtl w:val="0"/>
-        </w:rPr>
-        <w:t xml:space="preserve">No se admitirán contratos públicamente incompletos.</w:t>
+        <w:t xml:space="preserve">Todo </w:t>
+      </w:r>
+      <w:r>
+        <w:rPr>
+          <w:rFonts w:ascii="Roboto Mono" w:cs="Roboto Mono" w:eastAsia="Roboto Mono" w:hAnsi="Roboto Mono"/>
+          <w:color w:val="188038"/>
+          <w:rtl w:val="0"/>
+        </w:rPr>
+        <w:t xml:space="preserve">OperationalIntent</w:t>
+      </w:r>
+      <w:r>
+        <w:rPr>
+          <w:rtl w:val="0"/>
+        </w:rPr>
+        <w:t xml:space="preserve"> deberá representar completamente todas las </w:t>
+      </w:r>
+      <w:r>
+        <w:rPr>
+          <w:rFonts w:ascii="Roboto Mono" w:cs="Roboto Mono" w:eastAsia="Roboto Mono" w:hAnsi="Roboto Mono"/>
+          <w:color w:val="188038"/>
+          <w:rtl w:val="0"/>
+        </w:rPr>
+        <w:t xml:space="preserve">PortfolioPositionTransition</w:t>
+      </w:r>
+      <w:r>
+        <w:rPr>
+          <w:rtl w:val="0"/>
+        </w:rPr>
+        <w:t xml:space="preserve"> materiales de la </w:t>
+      </w:r>
+      <w:r>
+        <w:rPr>
+          <w:rFonts w:ascii="Roboto Mono" w:cs="Roboto Mono" w:eastAsia="Roboto Mono" w:hAnsi="Roboto Mono"/>
+          <w:color w:val="188038"/>
+          <w:rtl w:val="0"/>
+        </w:rPr>
+        <w:t xml:space="preserve">PortfolioTransition</w:t>
+      </w:r>
+      <w:r>
+        <w:rPr>
+          <w:rtl w:val="0"/>
+        </w:rPr>
+        <w:t xml:space="preserve"> de origen mediante operaciones coherentes.</w:t>
+      </w:r>
+    </w:p>
+    <w:p>
+      <w:pPr>
+        <w:spacing w:after="240" w:before="240" w:lineRule="auto"/>
+        <w:rPr/>
+      </w:pPr>
+      <w:r>
+        <w:rPr>
+          <w:rtl w:val="0"/>
+        </w:rPr>
+        <w:t xml:space="preserve">No podrá omitir transformaciones de posición materializables ni incorporar operaciones sin correspondencia contractual.</w:t>
+      </w:r>
+    </w:p>
+    <w:p>
+      <w:pPr>
+        <w:spacing w:after="240" w:before="240" w:lineRule="auto"/>
+        <w:rPr/>
+      </w:pPr>
+      <w:r>
+        <w:rPr>
+          <w:rtl w:val="0"/>
+        </w:rPr>
       </w:r>
     </w:p>
     <w:p>
@@ -2738,8 +3895,8 @@
           <w:szCs w:val="34"/>
         </w:rPr>
       </w:pPr>
-      <w:bookmarkStart w:colFirst="0" w:colLast="0" w:name="_fk6fmfu4uuvu" w:id="19"/>
-      <w:bookmarkEnd w:id="19"/>
+      <w:bookmarkStart w:colFirst="0" w:colLast="0" w:name="_fk6fmfu4uuvu" w:id="22"/>
+      <w:bookmarkEnd w:id="22"/>
       <w:r>
         <w:rPr>
           <w:b w:val="1"/>
@@ -2829,8 +3986,8 @@
           <w:szCs w:val="34"/>
         </w:rPr>
       </w:pPr>
-      <w:bookmarkStart w:colFirst="0" w:colLast="0" w:name="_i0flx6dxhhdr" w:id="20"/>
-      <w:bookmarkEnd w:id="20"/>
+      <w:bookmarkStart w:colFirst="0" w:colLast="0" w:name="_i0flx6dxhhdr" w:id="23"/>
+      <w:bookmarkEnd w:id="23"/>
       <w:r>
         <w:rPr>
           <w:b w:val="1"/>
@@ -2894,8 +4051,8 @@
           <w:szCs w:val="34"/>
         </w:rPr>
       </w:pPr>
-      <w:bookmarkStart w:colFirst="0" w:colLast="0" w:name="_llwakrctcr0h" w:id="21"/>
-      <w:bookmarkEnd w:id="21"/>
+      <w:bookmarkStart w:colFirst="0" w:colLast="0" w:name="_llwakrctcr0h" w:id="24"/>
+      <w:bookmarkEnd w:id="24"/>
       <w:r>
         <w:rPr>
           <w:b w:val="1"/>
@@ -2923,7 +4080,7 @@
       <w:pPr>
         <w:numPr>
           <w:ilvl w:val="0"/>
-          <w:numId w:val="7"/>
+          <w:numId w:val="10"/>
         </w:numPr>
         <w:spacing w:after="0" w:afterAutospacing="0" w:before="240" w:lineRule="auto"/>
         <w:ind w:left="720" w:hanging="360"/>
@@ -2939,7 +4096,7 @@
       <w:pPr>
         <w:numPr>
           <w:ilvl w:val="0"/>
-          <w:numId w:val="7"/>
+          <w:numId w:val="10"/>
         </w:numPr>
         <w:spacing w:after="0" w:afterAutospacing="0" w:before="0" w:beforeAutospacing="0" w:lineRule="auto"/>
         <w:ind w:left="720" w:hanging="360"/>
@@ -2955,7 +4112,7 @@
       <w:pPr>
         <w:numPr>
           <w:ilvl w:val="0"/>
-          <w:numId w:val="7"/>
+          <w:numId w:val="10"/>
         </w:numPr>
         <w:spacing w:after="0" w:afterAutospacing="0" w:before="0" w:beforeAutospacing="0" w:lineRule="auto"/>
         <w:ind w:left="720" w:hanging="360"/>
@@ -2971,7 +4128,7 @@
       <w:pPr>
         <w:numPr>
           <w:ilvl w:val="0"/>
-          <w:numId w:val="7"/>
+          <w:numId w:val="10"/>
         </w:numPr>
         <w:spacing w:after="0" w:afterAutospacing="0" w:before="0" w:beforeAutospacing="0" w:lineRule="auto"/>
         <w:ind w:left="720" w:hanging="360"/>
@@ -2987,7 +4144,7 @@
       <w:pPr>
         <w:numPr>
           <w:ilvl w:val="0"/>
-          <w:numId w:val="7"/>
+          <w:numId w:val="10"/>
         </w:numPr>
         <w:spacing w:after="0" w:afterAutospacing="0" w:before="0" w:beforeAutospacing="0" w:lineRule="auto"/>
         <w:ind w:left="720" w:hanging="360"/>
@@ -3003,7 +4160,7 @@
       <w:pPr>
         <w:numPr>
           <w:ilvl w:val="0"/>
-          <w:numId w:val="7"/>
+          <w:numId w:val="10"/>
         </w:numPr>
         <w:spacing w:after="240" w:before="0" w:beforeAutospacing="0" w:lineRule="auto"/>
         <w:ind w:left="720" w:hanging="360"/>
@@ -3013,6 +4170,237 @@
           <w:rtl w:val="0"/>
         </w:rPr>
         <w:t xml:space="preserve">infraestructura técnica.</w:t>
+      </w:r>
+    </w:p>
+    <w:p>
+      <w:pPr>
+        <w:pStyle w:val="Heading3"/>
+        <w:keepNext w:val="0"/>
+        <w:keepLines w:val="0"/>
+        <w:spacing w:before="280" w:lineRule="auto"/>
+        <w:rPr>
+          <w:b w:val="1"/>
+          <w:bCs w:val="1"/>
+          <w:color w:val="000000"/>
+          <w:sz w:val="26"/>
+          <w:szCs w:val="26"/>
+        </w:rPr>
+      </w:pPr>
+      <w:bookmarkStart w:colFirst="0" w:colLast="0" w:name="_a5w4wwjt8v8d" w:id="25"/>
+      <w:bookmarkEnd w:id="25"/>
+      <w:r>
+        <w:rPr>
+          <w:b w:val="1"/>
+          <w:bCs w:val="1"/>
+          <w:color w:val="000000"/>
+          <w:sz w:val="26"/>
+          <w:szCs w:val="26"/>
+          <w:rtl w:val="0"/>
+        </w:rPr>
+        <w:t xml:space="preserve">15.7 Correspondencia operacional</w:t>
+      </w:r>
+    </w:p>
+    <w:p>
+      <w:pPr>
+        <w:spacing w:after="240" w:before="240" w:lineRule="auto"/>
+        <w:ind w:left="600" w:right="600" w:firstLine="0"/>
+        <w:rPr/>
+      </w:pPr>
+      <w:r>
+        <w:rPr>
+          <w:rtl w:val="0"/>
+        </w:rPr>
+        <w:t xml:space="preserve">Cada </w:t>
+      </w:r>
+      <w:r>
+        <w:rPr>
+          <w:rFonts w:ascii="Roboto Mono" w:cs="Roboto Mono" w:eastAsia="Roboto Mono" w:hAnsi="Roboto Mono"/>
+          <w:color w:val="188038"/>
+          <w:rtl w:val="0"/>
+        </w:rPr>
+        <w:t xml:space="preserve">InvestmentOperation</w:t>
+      </w:r>
+      <w:r>
+        <w:rPr>
+          <w:rtl w:val="0"/>
+        </w:rPr>
+        <w:t xml:space="preserve"> deberá corresponder inequívocamente a una única </w:t>
+      </w:r>
+      <w:r>
+        <w:rPr>
+          <w:rFonts w:ascii="Roboto Mono" w:cs="Roboto Mono" w:eastAsia="Roboto Mono" w:hAnsi="Roboto Mono"/>
+          <w:color w:val="188038"/>
+          <w:rtl w:val="0"/>
+        </w:rPr>
+        <w:t xml:space="preserve">PortfolioPositionTransition</w:t>
+      </w:r>
+      <w:r>
+        <w:rPr>
+          <w:rtl w:val="0"/>
+        </w:rPr>
+        <w:t xml:space="preserve"> perteneciente a la </w:t>
+      </w:r>
+      <w:r>
+        <w:rPr>
+          <w:rFonts w:ascii="Roboto Mono" w:cs="Roboto Mono" w:eastAsia="Roboto Mono" w:hAnsi="Roboto Mono"/>
+          <w:color w:val="188038"/>
+          <w:rtl w:val="0"/>
+        </w:rPr>
+        <w:t xml:space="preserve">PortfolioTransition</w:t>
+      </w:r>
+      <w:r>
+        <w:rPr>
+          <w:rtl w:val="0"/>
+        </w:rPr>
+        <w:t xml:space="preserve"> de origen.</w:t>
+      </w:r>
+    </w:p>
+    <w:p>
+      <w:pPr>
+        <w:pStyle w:val="Heading3"/>
+        <w:keepNext w:val="0"/>
+        <w:keepLines w:val="0"/>
+        <w:spacing w:before="280" w:lineRule="auto"/>
+        <w:rPr>
+          <w:b w:val="1"/>
+          <w:bCs w:val="1"/>
+          <w:color w:val="000000"/>
+          <w:sz w:val="26"/>
+          <w:szCs w:val="26"/>
+        </w:rPr>
+      </w:pPr>
+      <w:bookmarkStart w:colFirst="0" w:colLast="0" w:name="_e3z85i9ohaow" w:id="26"/>
+      <w:bookmarkEnd w:id="26"/>
+      <w:r>
+        <w:rPr>
+          <w:b w:val="1"/>
+          <w:bCs w:val="1"/>
+          <w:color w:val="000000"/>
+          <w:sz w:val="26"/>
+          <w:szCs w:val="26"/>
+          <w:rtl w:val="0"/>
+        </w:rPr>
+        <w:t xml:space="preserve">15.8 Dirección operacional</w:t>
+      </w:r>
+    </w:p>
+    <w:p>
+      <w:pPr>
+        <w:spacing w:after="240" w:before="240" w:lineRule="auto"/>
+        <w:ind w:left="600" w:right="600" w:firstLine="0"/>
+        <w:rPr/>
+      </w:pPr>
+      <w:r>
+        <w:rPr>
+          <w:rtl w:val="0"/>
+        </w:rPr>
+        <w:t xml:space="preserve">Una transformación positiva de posición tendrá semántica </w:t>
+      </w:r>
+      <w:r>
+        <w:rPr>
+          <w:rFonts w:ascii="Roboto Mono" w:cs="Roboto Mono" w:eastAsia="Roboto Mono" w:hAnsi="Roboto Mono"/>
+          <w:color w:val="188038"/>
+          <w:rtl w:val="0"/>
+        </w:rPr>
+        <w:t xml:space="preserve">BUY</w:t>
+      </w:r>
+      <w:r>
+        <w:rPr>
+          <w:rtl w:val="0"/>
+        </w:rPr>
+        <w:t xml:space="preserve">.</w:t>
+      </w:r>
+    </w:p>
+    <w:p>
+      <w:pPr>
+        <w:spacing w:after="240" w:before="240" w:lineRule="auto"/>
+        <w:ind w:left="600" w:right="600" w:firstLine="0"/>
+        <w:rPr/>
+      </w:pPr>
+      <w:r>
+        <w:rPr>
+          <w:rtl w:val="0"/>
+        </w:rPr>
+        <w:t xml:space="preserve">Una transformación negativa de posición tendrá semántica </w:t>
+      </w:r>
+      <w:r>
+        <w:rPr>
+          <w:rFonts w:ascii="Roboto Mono" w:cs="Roboto Mono" w:eastAsia="Roboto Mono" w:hAnsi="Roboto Mono"/>
+          <w:color w:val="188038"/>
+          <w:rtl w:val="0"/>
+        </w:rPr>
+        <w:t xml:space="preserve">SELL</w:t>
+      </w:r>
+      <w:r>
+        <w:rPr>
+          <w:rtl w:val="0"/>
+        </w:rPr>
+        <w:t xml:space="preserve">.</w:t>
+      </w:r>
+    </w:p>
+    <w:p>
+      <w:pPr>
+        <w:pStyle w:val="Heading3"/>
+        <w:keepNext w:val="0"/>
+        <w:keepLines w:val="0"/>
+        <w:spacing w:before="280" w:lineRule="auto"/>
+        <w:rPr>
+          <w:b w:val="1"/>
+          <w:bCs w:val="1"/>
+          <w:color w:val="000000"/>
+          <w:sz w:val="26"/>
+          <w:szCs w:val="26"/>
+        </w:rPr>
+      </w:pPr>
+      <w:bookmarkStart w:colFirst="0" w:colLast="0" w:name="_n6mecijtjo15" w:id="27"/>
+      <w:bookmarkEnd w:id="27"/>
+      <w:r>
+        <w:rPr>
+          <w:b w:val="1"/>
+          <w:bCs w:val="1"/>
+          <w:color w:val="000000"/>
+          <w:sz w:val="26"/>
+          <w:szCs w:val="26"/>
+          <w:rtl w:val="0"/>
+        </w:rPr>
+        <w:t xml:space="preserve">15.9 Neutralidad monetaria del incremento</w:t>
+      </w:r>
+    </w:p>
+    <w:p>
+      <w:pPr>
+        <w:spacing w:after="240" w:before="240" w:lineRule="auto"/>
+        <w:ind w:left="600" w:right="600" w:firstLine="0"/>
+        <w:rPr/>
+      </w:pPr>
+      <w:r>
+        <w:rPr>
+          <w:rtl w:val="0"/>
+        </w:rPr>
+        <w:t xml:space="preserve">Ninguna </w:t>
+      </w:r>
+      <w:r>
+        <w:rPr>
+          <w:rFonts w:ascii="Roboto Mono" w:cs="Roboto Mono" w:eastAsia="Roboto Mono" w:hAnsi="Roboto Mono"/>
+          <w:color w:val="188038"/>
+          <w:rtl w:val="0"/>
+        </w:rPr>
+        <w:t xml:space="preserve">PortfolioMonetaryTransition</w:t>
+      </w:r>
+      <w:r>
+        <w:rPr>
+          <w:rtl w:val="0"/>
+        </w:rPr>
+        <w:t xml:space="preserve"> deberá interpretarse automáticamente como una operación autónoma dentro de IT-034-001.</w:t>
+      </w:r>
+    </w:p>
+    <w:p>
+      <w:pPr>
+        <w:spacing w:after="240" w:before="240" w:lineRule="auto"/>
+        <w:rPr/>
+      </w:pPr>
+      <w:r>
+        <w:rPr>
+          <w:rtl w:val="0"/>
+        </w:rPr>
       </w:r>
     </w:p>
     <w:p>
@@ -3043,8 +4431,8 @@
           <w:szCs w:val="46"/>
         </w:rPr>
       </w:pPr>
-      <w:bookmarkStart w:colFirst="0" w:colLast="0" w:name="_ndtp30uiiniw" w:id="22"/>
-      <w:bookmarkEnd w:id="22"/>
+      <w:bookmarkStart w:colFirst="0" w:colLast="0" w:name="_ndtp30uiiniw" w:id="28"/>
+      <w:bookmarkEnd w:id="28"/>
       <w:r>
         <w:rPr>
           <w:b w:val="1"/>
@@ -3072,7 +4460,7 @@
       <w:pPr>
         <w:numPr>
           <w:ilvl w:val="0"/>
-          <w:numId w:val="2"/>
+          <w:numId w:val="4"/>
         </w:numPr>
         <w:spacing w:after="0" w:afterAutospacing="0" w:before="240" w:lineRule="auto"/>
         <w:ind w:left="720" w:hanging="360"/>
@@ -3088,7 +4476,7 @@
       <w:pPr>
         <w:numPr>
           <w:ilvl w:val="0"/>
-          <w:numId w:val="2"/>
+          <w:numId w:val="4"/>
         </w:numPr>
         <w:spacing w:after="0" w:afterAutospacing="0" w:before="0" w:beforeAutospacing="0" w:lineRule="auto"/>
         <w:ind w:left="720" w:hanging="360"/>
@@ -3104,7 +4492,7 @@
       <w:pPr>
         <w:numPr>
           <w:ilvl w:val="0"/>
-          <w:numId w:val="2"/>
+          <w:numId w:val="4"/>
         </w:numPr>
         <w:spacing w:after="0" w:afterAutospacing="0" w:before="0" w:beforeAutospacing="0" w:lineRule="auto"/>
         <w:ind w:left="720" w:hanging="360"/>
@@ -3120,7 +4508,7 @@
       <w:pPr>
         <w:numPr>
           <w:ilvl w:val="0"/>
-          <w:numId w:val="2"/>
+          <w:numId w:val="4"/>
         </w:numPr>
         <w:spacing w:after="240" w:before="0" w:beforeAutospacing="0" w:lineRule="auto"/>
         <w:ind w:left="720" w:hanging="360"/>
@@ -3172,8 +4560,8 @@
           <w:szCs w:val="46"/>
         </w:rPr>
       </w:pPr>
-      <w:bookmarkStart w:colFirst="0" w:colLast="0" w:name="_f6jprup9bix7" w:id="23"/>
-      <w:bookmarkEnd w:id="23"/>
+      <w:bookmarkStart w:colFirst="0" w:colLast="0" w:name="_f6jprup9bix7" w:id="29"/>
+      <w:bookmarkEnd w:id="29"/>
       <w:r>
         <w:rPr>
           <w:b w:val="1"/>
@@ -3201,7 +4589,7 @@
       <w:pPr>
         <w:numPr>
           <w:ilvl w:val="0"/>
-          <w:numId w:val="14"/>
+          <w:numId w:val="18"/>
         </w:numPr>
         <w:spacing w:after="0" w:afterAutospacing="0" w:before="240" w:lineRule="auto"/>
         <w:ind w:left="720" w:hanging="360"/>
@@ -3217,7 +4605,7 @@
       <w:pPr>
         <w:numPr>
           <w:ilvl w:val="0"/>
-          <w:numId w:val="14"/>
+          <w:numId w:val="18"/>
         </w:numPr>
         <w:spacing w:after="0" w:afterAutospacing="0" w:before="0" w:beforeAutospacing="0" w:lineRule="auto"/>
         <w:ind w:left="720" w:hanging="360"/>
@@ -3247,6 +4635,86 @@
       <w:pPr>
         <w:numPr>
           <w:ilvl w:val="0"/>
+          <w:numId w:val="18"/>
+        </w:numPr>
+        <w:spacing w:after="0" w:afterAutospacing="0" w:before="0" w:beforeAutospacing="0" w:lineRule="auto"/>
+        <w:ind w:left="720" w:hanging="360"/>
+      </w:pPr>
+      <w:r>
+        <w:rPr>
+          <w:rtl w:val="0"/>
+        </w:rPr>
+        <w:t xml:space="preserve">El contrato representa completamente las operaciones necesarias para materializar dicha transición.</w:t>
+      </w:r>
+    </w:p>
+    <w:p>
+      <w:pPr>
+        <w:numPr>
+          <w:ilvl w:val="0"/>
+          <w:numId w:val="18"/>
+        </w:numPr>
+        <w:spacing w:after="0" w:afterAutospacing="0" w:before="0" w:beforeAutospacing="0" w:lineRule="auto"/>
+        <w:ind w:left="720" w:hanging="360"/>
+      </w:pPr>
+      <w:r>
+        <w:rPr>
+          <w:rtl w:val="0"/>
+        </w:rPr>
+        <w:t xml:space="preserve">Las relaciones contractuales autorizadas se preservan.</w:t>
+      </w:r>
+    </w:p>
+    <w:p>
+      <w:pPr>
+        <w:numPr>
+          <w:ilvl w:val="0"/>
+          <w:numId w:val="18"/>
+        </w:numPr>
+        <w:spacing w:after="0" w:afterAutospacing="0" w:before="0" w:beforeAutospacing="0" w:lineRule="auto"/>
+        <w:ind w:left="720" w:hanging="360"/>
+      </w:pPr>
+      <w:r>
+        <w:rPr>
+          <w:rtl w:val="0"/>
+        </w:rPr>
+        <w:t xml:space="preserve">Las invariantes públicas permanecen satisfechas.</w:t>
+      </w:r>
+    </w:p>
+    <w:p>
+      <w:pPr>
+        <w:numPr>
+          <w:ilvl w:val="0"/>
+          <w:numId w:val="18"/>
+        </w:numPr>
+        <w:spacing w:after="0" w:afterAutospacing="0" w:before="0" w:beforeAutospacing="0" w:lineRule="auto"/>
+        <w:ind w:left="720" w:hanging="360"/>
+      </w:pPr>
+      <w:r>
+        <w:rPr>
+          <w:rtl w:val="0"/>
+        </w:rPr>
+        <w:t xml:space="preserve">Las violaciones contractuales producen exclusivamente excepciones públicas compatibles con esta especificación.</w:t>
+      </w:r>
+    </w:p>
+    <w:p>
+      <w:pPr>
+        <w:numPr>
+          <w:ilvl w:val="0"/>
+          <w:numId w:val="18"/>
+        </w:numPr>
+        <w:spacing w:after="0" w:afterAutospacing="0" w:before="0" w:beforeAutospacing="0" w:lineRule="auto"/>
+        <w:ind w:left="720" w:hanging="360"/>
+      </w:pPr>
+      <w:r>
+        <w:rPr>
+          <w:rtl w:val="0"/>
+        </w:rPr>
+        <w:t xml:space="preserve">No aparecen dependencias públicas hacia infraestructura.</w:t>
+      </w:r>
+    </w:p>
+    <w:p>
+      <w:pPr>
+        <w:numPr>
+          <w:ilvl w:val="0"/>
           <w:numId w:val="14"/>
         </w:numPr>
         <w:spacing w:after="0" w:afterAutospacing="0" w:before="0" w:beforeAutospacing="0" w:lineRule="auto"/>
@@ -3256,7 +4724,21 @@
         <w:rPr>
           <w:rtl w:val="0"/>
         </w:rPr>
-        <w:t xml:space="preserve">El contrato representa completamente las operaciones necesarias para materializar dicha transición.</w:t>
+        <w:t xml:space="preserve">el activo publicado es </w:t>
+      </w:r>
+      <w:r>
+        <w:rPr>
+          <w:rFonts w:ascii="Roboto Mono" w:cs="Roboto Mono" w:eastAsia="Roboto Mono" w:hAnsi="Roboto Mono"/>
+          <w:color w:val="188038"/>
+          <w:rtl w:val="0"/>
+        </w:rPr>
+        <w:t xml:space="preserve">OperationalIntent</w:t>
+      </w:r>
+      <w:r>
+        <w:rPr>
+          <w:rtl w:val="0"/>
+        </w:rPr>
+        <w:t xml:space="preserve">;</w:t>
       </w:r>
     </w:p>
     <w:p>
@@ -3272,7 +4754,21 @@
         <w:rPr>
           <w:rtl w:val="0"/>
         </w:rPr>
-        <w:t xml:space="preserve">Las relaciones contractuales autorizadas se preservan.</w:t>
+        <w:t xml:space="preserve">sus operaciones constitutivas representan </w:t>
+      </w:r>
+      <w:r>
+        <w:rPr>
+          <w:rFonts w:ascii="Roboto Mono" w:cs="Roboto Mono" w:eastAsia="Roboto Mono" w:hAnsi="Roboto Mono"/>
+          <w:color w:val="188038"/>
+          <w:rtl w:val="0"/>
+        </w:rPr>
+        <w:t xml:space="preserve">InvestmentOperation</w:t>
+      </w:r>
+      <w:r>
+        <w:rPr>
+          <w:rtl w:val="0"/>
+        </w:rPr>
+        <w:t xml:space="preserve">;</w:t>
       </w:r>
     </w:p>
     <w:p>
@@ -3288,7 +4784,7 @@
         <w:rPr>
           <w:rtl w:val="0"/>
         </w:rPr>
-        <w:t xml:space="preserve">Las invariantes públicas permanecen satisfechas.</w:t>
+        <w:t xml:space="preserve">una transición positiva produce semántica BUY;</w:t>
       </w:r>
     </w:p>
     <w:p>
@@ -3304,7 +4800,7 @@
         <w:rPr>
           <w:rtl w:val="0"/>
         </w:rPr>
-        <w:t xml:space="preserve">Las violaciones contractuales producen exclusivamente excepciones públicas compatibles con esta especificación.</w:t>
+        <w:t xml:space="preserve">una transición negativa produce semántica SELL;</w:t>
       </w:r>
     </w:p>
     <w:p>
@@ -3313,6 +4809,54 @@
           <w:ilvl w:val="0"/>
           <w:numId w:val="14"/>
         </w:numPr>
+        <w:spacing w:after="0" w:afterAutospacing="0" w:before="0" w:beforeAutospacing="0" w:lineRule="auto"/>
+        <w:ind w:left="720" w:hanging="360"/>
+      </w:pPr>
+      <w:r>
+        <w:rPr>
+          <w:rtl w:val="0"/>
+        </w:rPr>
+        <w:t xml:space="preserve">todas las transformaciones materiales de posición están representadas;</w:t>
+      </w:r>
+    </w:p>
+    <w:p>
+      <w:pPr>
+        <w:numPr>
+          <w:ilvl w:val="0"/>
+          <w:numId w:val="14"/>
+        </w:numPr>
+        <w:spacing w:after="0" w:afterAutospacing="0" w:before="0" w:beforeAutospacing="0" w:lineRule="auto"/>
+        <w:ind w:left="720" w:hanging="360"/>
+      </w:pPr>
+      <w:r>
+        <w:rPr>
+          <w:rtl w:val="0"/>
+        </w:rPr>
+        <w:t xml:space="preserve">no aparecen operaciones adicionales;</w:t>
+      </w:r>
+    </w:p>
+    <w:p>
+      <w:pPr>
+        <w:numPr>
+          <w:ilvl w:val="0"/>
+          <w:numId w:val="14"/>
+        </w:numPr>
+        <w:spacing w:after="0" w:afterAutospacing="0" w:before="0" w:beforeAutospacing="0" w:lineRule="auto"/>
+        <w:ind w:left="720" w:hanging="360"/>
+      </w:pPr>
+      <w:r>
+        <w:rPr>
+          <w:rtl w:val="0"/>
+        </w:rPr>
+        <w:t xml:space="preserve">las transformaciones monetarias no originan operaciones autónomas;</w:t>
+      </w:r>
+    </w:p>
+    <w:p>
+      <w:pPr>
+        <w:numPr>
+          <w:ilvl w:val="0"/>
+          <w:numId w:val="14"/>
+        </w:numPr>
         <w:spacing w:after="240" w:before="0" w:beforeAutospacing="0" w:lineRule="auto"/>
         <w:ind w:left="720" w:hanging="360"/>
       </w:pPr>
@@ -3320,7 +4864,32 @@
         <w:rPr>
           <w:rtl w:val="0"/>
         </w:rPr>
-        <w:t xml:space="preserve">No aparecen dependencias públicas hacia infraestructura.</w:t>
+        <w:t xml:space="preserve">la relación con </w:t>
+      </w:r>
+      <w:r>
+        <w:rPr>
+          <w:rFonts w:ascii="Roboto Mono" w:cs="Roboto Mono" w:eastAsia="Roboto Mono" w:hAnsi="Roboto Mono"/>
+          <w:color w:val="188038"/>
+          <w:rtl w:val="0"/>
+        </w:rPr>
+        <w:t xml:space="preserve">PortfolioTransition</w:t>
+      </w:r>
+      <w:r>
+        <w:rPr>
+          <w:rtl w:val="0"/>
+        </w:rPr>
+        <w:t xml:space="preserve"> permanece preservada.</w:t>
+      </w:r>
+    </w:p>
+    <w:p>
+      <w:pPr>
+        <w:spacing w:after="240" w:before="240" w:lineRule="auto"/>
+        <w:rPr/>
+      </w:pPr>
+      <w:r>
+        <w:rPr>
+          <w:rtl w:val="0"/>
+        </w:rPr>
       </w:r>
     </w:p>
     <w:p>
@@ -3333,6 +4902,28 @@
           <w:rtl w:val="0"/>
         </w:rPr>
         <w:t xml:space="preserve">Los criterios de aceptación deberán poder verificarse exclusivamente mediante el comportamiento observable del modelo.</w:t>
+      </w:r>
+    </w:p>
+    <w:p>
+      <w:pPr>
+        <w:spacing w:after="240" w:before="240" w:lineRule="auto"/>
+        <w:rPr/>
+      </w:pPr>
+      <w:r>
+        <w:rPr>
+          <w:rtl w:val="0"/>
+        </w:rPr>
+      </w:r>
+    </w:p>
+    <w:p>
+      <w:pPr>
+        <w:spacing w:after="240" w:before="240" w:lineRule="auto"/>
+        <w:rPr/>
+      </w:pPr>
+      <w:r>
+        <w:rPr>
+          <w:rtl w:val="0"/>
+        </w:rPr>
       </w:r>
     </w:p>
     <w:p>
@@ -3363,8 +4954,8 @@
           <w:szCs w:val="46"/>
         </w:rPr>
       </w:pPr>
-      <w:bookmarkStart w:colFirst="0" w:colLast="0" w:name="_yg8eg1jjilln" w:id="24"/>
-      <w:bookmarkEnd w:id="24"/>
+      <w:bookmarkStart w:colFirst="0" w:colLast="0" w:name="_yg8eg1jjilln" w:id="30"/>
+      <w:bookmarkEnd w:id="30"/>
       <w:r>
         <w:rPr>
           <w:b w:val="1"/>
@@ -3404,7 +4995,7 @@
       <w:pPr>
         <w:numPr>
           <w:ilvl w:val="0"/>
-          <w:numId w:val="6"/>
+          <w:numId w:val="9"/>
         </w:numPr>
         <w:spacing w:after="0" w:afterAutospacing="0" w:before="240" w:lineRule="auto"/>
         <w:ind w:left="720" w:hanging="360"/>
@@ -3420,7 +5011,7 @@
       <w:pPr>
         <w:numPr>
           <w:ilvl w:val="0"/>
-          <w:numId w:val="6"/>
+          <w:numId w:val="9"/>
         </w:numPr>
         <w:spacing w:after="0" w:afterAutospacing="0" w:before="0" w:beforeAutospacing="0" w:lineRule="auto"/>
         <w:ind w:left="720" w:hanging="360"/>
@@ -3436,7 +5027,7 @@
       <w:pPr>
         <w:numPr>
           <w:ilvl w:val="0"/>
-          <w:numId w:val="6"/>
+          <w:numId w:val="9"/>
         </w:numPr>
         <w:spacing w:after="0" w:afterAutospacing="0" w:before="0" w:beforeAutospacing="0" w:lineRule="auto"/>
         <w:ind w:left="720" w:hanging="360"/>
@@ -3466,7 +5057,7 @@
       <w:pPr>
         <w:numPr>
           <w:ilvl w:val="0"/>
-          <w:numId w:val="6"/>
+          <w:numId w:val="9"/>
         </w:numPr>
         <w:spacing w:after="0" w:afterAutospacing="0" w:before="0" w:beforeAutospacing="0" w:lineRule="auto"/>
         <w:ind w:left="720" w:hanging="360"/>
@@ -3482,7 +5073,7 @@
       <w:pPr>
         <w:numPr>
           <w:ilvl w:val="0"/>
-          <w:numId w:val="6"/>
+          <w:numId w:val="9"/>
         </w:numPr>
         <w:spacing w:after="0" w:afterAutospacing="0" w:before="0" w:beforeAutospacing="0" w:lineRule="auto"/>
         <w:ind w:left="720" w:hanging="360"/>
@@ -3498,7 +5089,103 @@
       <w:pPr>
         <w:numPr>
           <w:ilvl w:val="0"/>
-          <w:numId w:val="6"/>
+          <w:numId w:val="9"/>
+        </w:numPr>
+        <w:spacing w:after="0" w:afterAutospacing="0" w:before="0" w:beforeAutospacing="0" w:lineRule="auto"/>
+        <w:ind w:left="720" w:hanging="360"/>
+      </w:pPr>
+      <w:r>
+        <w:rPr>
+          <w:rtl w:val="0"/>
+        </w:rPr>
+        <w:t xml:space="preserve">la ausencia de dependencias públicas no autorizadas.</w:t>
+      </w:r>
+    </w:p>
+    <w:p>
+      <w:pPr>
+        <w:numPr>
+          <w:ilvl w:val="0"/>
+          <w:numId w:val="9"/>
+        </w:numPr>
+        <w:spacing w:after="0" w:afterAutospacing="0" w:before="0" w:beforeAutospacing="0" w:lineRule="auto"/>
+        <w:ind w:left="720" w:hanging="360"/>
+      </w:pPr>
+      <w:r>
+        <w:rPr>
+          <w:rtl w:val="0"/>
+        </w:rPr>
+        <w:t xml:space="preserve">correspondencia completa entre transformaciones de posición y operaciones;</w:t>
+      </w:r>
+    </w:p>
+    <w:p>
+      <w:pPr>
+        <w:numPr>
+          <w:ilvl w:val="0"/>
+          <w:numId w:val="9"/>
+        </w:numPr>
+        <w:spacing w:after="0" w:afterAutospacing="0" w:before="0" w:beforeAutospacing="0" w:lineRule="auto"/>
+        <w:ind w:left="720" w:hanging="360"/>
+      </w:pPr>
+      <w:r>
+        <w:rPr>
+          <w:rtl w:val="0"/>
+        </w:rPr>
+        <w:t xml:space="preserve">dirección operacional correcta;</w:t>
+      </w:r>
+    </w:p>
+    <w:p>
+      <w:pPr>
+        <w:numPr>
+          <w:ilvl w:val="0"/>
+          <w:numId w:val="9"/>
+        </w:numPr>
+        <w:spacing w:after="0" w:afterAutospacing="0" w:before="0" w:beforeAutospacing="0" w:lineRule="auto"/>
+        <w:ind w:left="720" w:hanging="360"/>
+      </w:pPr>
+      <w:r>
+        <w:rPr>
+          <w:rtl w:val="0"/>
+        </w:rPr>
+        <w:t xml:space="preserve">ausencia de operaciones sin transición correspondiente;</w:t>
+      </w:r>
+    </w:p>
+    <w:p>
+      <w:pPr>
+        <w:numPr>
+          <w:ilvl w:val="0"/>
+          <w:numId w:val="9"/>
+        </w:numPr>
+        <w:spacing w:after="0" w:afterAutospacing="0" w:before="0" w:beforeAutospacing="0" w:lineRule="auto"/>
+        <w:ind w:left="720" w:hanging="360"/>
+      </w:pPr>
+      <w:r>
+        <w:rPr>
+          <w:rtl w:val="0"/>
+        </w:rPr>
+        <w:t xml:space="preserve">preservación de la transición de origen;</w:t>
+      </w:r>
+    </w:p>
+    <w:p>
+      <w:pPr>
+        <w:numPr>
+          <w:ilvl w:val="0"/>
+          <w:numId w:val="9"/>
+        </w:numPr>
+        <w:spacing w:after="0" w:afterAutospacing="0" w:before="0" w:beforeAutospacing="0" w:lineRule="auto"/>
+        <w:ind w:left="720" w:hanging="360"/>
+      </w:pPr>
+      <w:r>
+        <w:rPr>
+          <w:rtl w:val="0"/>
+        </w:rPr>
+        <w:t xml:space="preserve">ausencia de materialización autónoma de transformaciones monetarias;</w:t>
+      </w:r>
+    </w:p>
+    <w:p>
+      <w:pPr>
+        <w:numPr>
+          <w:ilvl w:val="0"/>
+          <w:numId w:val="9"/>
         </w:numPr>
         <w:spacing w:after="240" w:before="0" w:beforeAutospacing="0" w:lineRule="auto"/>
         <w:ind w:left="720" w:hanging="360"/>
@@ -3507,7 +5194,19 @@
         <w:rPr>
           <w:rtl w:val="0"/>
         </w:rPr>
-        <w:t xml:space="preserve">la ausencia de dependencias públicas no autorizadas.</w:t>
+        <w:t xml:space="preserve">API pública limitada al alcance autorizado.</w:t>
+      </w:r>
+    </w:p>
+    <w:p>
+      <w:pPr>
+        <w:spacing w:after="240" w:before="240" w:lineRule="auto"/>
+        <w:ind w:left="720" w:firstLine="0"/>
+        <w:rPr/>
+      </w:pPr>
+      <w:r>
+        <w:rPr>
+          <w:rtl w:val="0"/>
+        </w:rPr>
       </w:r>
     </w:p>
     <w:p>
@@ -3526,7 +5225,7 @@
       <w:pPr>
         <w:numPr>
           <w:ilvl w:val="0"/>
-          <w:numId w:val="17"/>
+          <w:numId w:val="21"/>
         </w:numPr>
         <w:spacing w:after="0" w:afterAutospacing="0" w:before="240" w:lineRule="auto"/>
         <w:ind w:left="720" w:hanging="360"/>
@@ -3542,7 +5241,7 @@
       <w:pPr>
         <w:numPr>
           <w:ilvl w:val="0"/>
-          <w:numId w:val="17"/>
+          <w:numId w:val="21"/>
         </w:numPr>
         <w:spacing w:after="0" w:afterAutospacing="0" w:before="0" w:beforeAutospacing="0" w:lineRule="auto"/>
         <w:ind w:left="720" w:hanging="360"/>
@@ -3558,7 +5257,7 @@
       <w:pPr>
         <w:numPr>
           <w:ilvl w:val="0"/>
-          <w:numId w:val="17"/>
+          <w:numId w:val="21"/>
         </w:numPr>
         <w:spacing w:after="0" w:afterAutospacing="0" w:before="0" w:beforeAutospacing="0" w:lineRule="auto"/>
         <w:ind w:left="720" w:hanging="360"/>
@@ -3574,7 +5273,7 @@
       <w:pPr>
         <w:numPr>
           <w:ilvl w:val="0"/>
-          <w:numId w:val="17"/>
+          <w:numId w:val="21"/>
         </w:numPr>
         <w:spacing w:after="240" w:before="0" w:beforeAutospacing="0" w:lineRule="auto"/>
         <w:ind w:left="720" w:hanging="360"/>
@@ -3614,8 +5313,8 @@
           <w:szCs w:val="46"/>
         </w:rPr>
       </w:pPr>
-      <w:bookmarkStart w:colFirst="0" w:colLast="0" w:name="_vswq2ercega7" w:id="25"/>
-      <w:bookmarkEnd w:id="25"/>
+      <w:bookmarkStart w:colFirst="0" w:colLast="0" w:name="_vswq2ercega7" w:id="31"/>
+      <w:bookmarkEnd w:id="31"/>
       <w:r>
         <w:rPr>
           <w:b w:val="1"/>
@@ -3643,7 +5342,7 @@
       <w:pPr>
         <w:numPr>
           <w:ilvl w:val="0"/>
-          <w:numId w:val="10"/>
+          <w:numId w:val="13"/>
         </w:numPr>
         <w:spacing w:after="0" w:afterAutospacing="0" w:before="240" w:lineRule="auto"/>
         <w:ind w:left="720" w:hanging="360"/>
@@ -3659,7 +5358,7 @@
       <w:pPr>
         <w:numPr>
           <w:ilvl w:val="0"/>
-          <w:numId w:val="10"/>
+          <w:numId w:val="13"/>
         </w:numPr>
         <w:spacing w:after="0" w:afterAutospacing="0" w:before="0" w:beforeAutospacing="0" w:lineRule="auto"/>
         <w:ind w:left="720" w:hanging="360"/>
@@ -3675,7 +5374,7 @@
       <w:pPr>
         <w:numPr>
           <w:ilvl w:val="0"/>
-          <w:numId w:val="10"/>
+          <w:numId w:val="13"/>
         </w:numPr>
         <w:spacing w:after="0" w:afterAutospacing="0" w:before="0" w:beforeAutospacing="0" w:lineRule="auto"/>
         <w:ind w:left="720" w:hanging="360"/>
@@ -3691,7 +5390,7 @@
       <w:pPr>
         <w:numPr>
           <w:ilvl w:val="0"/>
-          <w:numId w:val="10"/>
+          <w:numId w:val="13"/>
         </w:numPr>
         <w:spacing w:after="0" w:afterAutospacing="0" w:before="0" w:beforeAutospacing="0" w:lineRule="auto"/>
         <w:ind w:left="720" w:hanging="360"/>
@@ -3707,7 +5406,7 @@
       <w:pPr>
         <w:numPr>
           <w:ilvl w:val="0"/>
-          <w:numId w:val="10"/>
+          <w:numId w:val="13"/>
         </w:numPr>
         <w:spacing w:after="0" w:afterAutospacing="0" w:before="0" w:beforeAutospacing="0" w:lineRule="auto"/>
         <w:ind w:left="720" w:hanging="360"/>
@@ -3723,7 +5422,7 @@
       <w:pPr>
         <w:numPr>
           <w:ilvl w:val="0"/>
-          <w:numId w:val="10"/>
+          <w:numId w:val="13"/>
         </w:numPr>
         <w:spacing w:after="240" w:before="0" w:beforeAutospacing="0" w:lineRule="auto"/>
         <w:ind w:left="720" w:hanging="360"/>
@@ -5529,6 +7228,446 @@
     </w:lvl>
   </w:abstractNum>
   <w:abstractNum w:abstractNumId="17">
+    <w:lvl w:ilvl="0">
+      <w:start w:val="1"/>
+      <w:numFmt w:val="bullet"/>
+      <w:lvlText w:val="●"/>
+      <w:lvlJc w:val="left"/>
+      <w:pPr>
+        <w:ind w:left="720" w:hanging="360"/>
+      </w:pPr>
+      <w:rPr>
+        <w:u w:val="none"/>
+      </w:rPr>
+    </w:lvl>
+    <w:lvl w:ilvl="1">
+      <w:start w:val="1"/>
+      <w:numFmt w:val="bullet"/>
+      <w:lvlText w:val="○"/>
+      <w:lvlJc w:val="left"/>
+      <w:pPr>
+        <w:ind w:left="1440" w:hanging="360"/>
+      </w:pPr>
+      <w:rPr>
+        <w:u w:val="none"/>
+      </w:rPr>
+    </w:lvl>
+    <w:lvl w:ilvl="2">
+      <w:start w:val="1"/>
+      <w:numFmt w:val="bullet"/>
+      <w:lvlText w:val="■"/>
+      <w:lvlJc w:val="left"/>
+      <w:pPr>
+        <w:ind w:left="2160" w:hanging="360"/>
+      </w:pPr>
+      <w:rPr>
+        <w:u w:val="none"/>
+      </w:rPr>
+    </w:lvl>
+    <w:lvl w:ilvl="3">
+      <w:start w:val="1"/>
+      <w:numFmt w:val="bullet"/>
+      <w:lvlText w:val="●"/>
+      <w:lvlJc w:val="left"/>
+      <w:pPr>
+        <w:ind w:left="2880" w:hanging="360"/>
+      </w:pPr>
+      <w:rPr>
+        <w:u w:val="none"/>
+      </w:rPr>
+    </w:lvl>
+    <w:lvl w:ilvl="4">
+      <w:start w:val="1"/>
+      <w:numFmt w:val="bullet"/>
+      <w:lvlText w:val="○"/>
+      <w:lvlJc w:val="left"/>
+      <w:pPr>
+        <w:ind w:left="3600" w:hanging="360"/>
+      </w:pPr>
+      <w:rPr>
+        <w:u w:val="none"/>
+      </w:rPr>
+    </w:lvl>
+    <w:lvl w:ilvl="5">
+      <w:start w:val="1"/>
+      <w:numFmt w:val="bullet"/>
+      <w:lvlText w:val="■"/>
+      <w:lvlJc w:val="left"/>
+      <w:pPr>
+        <w:ind w:left="4320" w:hanging="360"/>
+      </w:pPr>
+      <w:rPr>
+        <w:u w:val="none"/>
+      </w:rPr>
+    </w:lvl>
+    <w:lvl w:ilvl="6">
+      <w:start w:val="1"/>
+      <w:numFmt w:val="bullet"/>
+      <w:lvlText w:val="●"/>
+      <w:lvlJc w:val="left"/>
+      <w:pPr>
+        <w:ind w:left="5040" w:hanging="360"/>
+      </w:pPr>
+      <w:rPr>
+        <w:u w:val="none"/>
+      </w:rPr>
+    </w:lvl>
+    <w:lvl w:ilvl="7">
+      <w:start w:val="1"/>
+      <w:numFmt w:val="bullet"/>
+      <w:lvlText w:val="○"/>
+      <w:lvlJc w:val="left"/>
+      <w:pPr>
+        <w:ind w:left="5760" w:hanging="360"/>
+      </w:pPr>
+      <w:rPr>
+        <w:u w:val="none"/>
+      </w:rPr>
+    </w:lvl>
+    <w:lvl w:ilvl="8">
+      <w:start w:val="1"/>
+      <w:numFmt w:val="bullet"/>
+      <w:lvlText w:val="■"/>
+      <w:lvlJc w:val="left"/>
+      <w:pPr>
+        <w:ind w:left="6480" w:hanging="360"/>
+      </w:pPr>
+      <w:rPr>
+        <w:u w:val="none"/>
+      </w:rPr>
+    </w:lvl>
+  </w:abstractNum>
+  <w:abstractNum w:abstractNumId="18">
+    <w:lvl w:ilvl="0">
+      <w:start w:val="1"/>
+      <w:numFmt w:val="bullet"/>
+      <w:lvlText w:val="●"/>
+      <w:lvlJc w:val="left"/>
+      <w:pPr>
+        <w:ind w:left="720" w:hanging="360"/>
+      </w:pPr>
+      <w:rPr>
+        <w:u w:val="none"/>
+      </w:rPr>
+    </w:lvl>
+    <w:lvl w:ilvl="1">
+      <w:start w:val="1"/>
+      <w:numFmt w:val="bullet"/>
+      <w:lvlText w:val="○"/>
+      <w:lvlJc w:val="left"/>
+      <w:pPr>
+        <w:ind w:left="1440" w:hanging="360"/>
+      </w:pPr>
+      <w:rPr>
+        <w:u w:val="none"/>
+      </w:rPr>
+    </w:lvl>
+    <w:lvl w:ilvl="2">
+      <w:start w:val="1"/>
+      <w:numFmt w:val="bullet"/>
+      <w:lvlText w:val="■"/>
+      <w:lvlJc w:val="left"/>
+      <w:pPr>
+        <w:ind w:left="2160" w:hanging="360"/>
+      </w:pPr>
+      <w:rPr>
+        <w:u w:val="none"/>
+      </w:rPr>
+    </w:lvl>
+    <w:lvl w:ilvl="3">
+      <w:start w:val="1"/>
+      <w:numFmt w:val="bullet"/>
+      <w:lvlText w:val="●"/>
+      <w:lvlJc w:val="left"/>
+      <w:pPr>
+        <w:ind w:left="2880" w:hanging="360"/>
+      </w:pPr>
+      <w:rPr>
+        <w:u w:val="none"/>
+      </w:rPr>
+    </w:lvl>
+    <w:lvl w:ilvl="4">
+      <w:start w:val="1"/>
+      <w:numFmt w:val="bullet"/>
+      <w:lvlText w:val="○"/>
+      <w:lvlJc w:val="left"/>
+      <w:pPr>
+        <w:ind w:left="3600" w:hanging="360"/>
+      </w:pPr>
+      <w:rPr>
+        <w:u w:val="none"/>
+      </w:rPr>
+    </w:lvl>
+    <w:lvl w:ilvl="5">
+      <w:start w:val="1"/>
+      <w:numFmt w:val="bullet"/>
+      <w:lvlText w:val="■"/>
+      <w:lvlJc w:val="left"/>
+      <w:pPr>
+        <w:ind w:left="4320" w:hanging="360"/>
+      </w:pPr>
+      <w:rPr>
+        <w:u w:val="none"/>
+      </w:rPr>
+    </w:lvl>
+    <w:lvl w:ilvl="6">
+      <w:start w:val="1"/>
+      <w:numFmt w:val="bullet"/>
+      <w:lvlText w:val="●"/>
+      <w:lvlJc w:val="left"/>
+      <w:pPr>
+        <w:ind w:left="5040" w:hanging="360"/>
+      </w:pPr>
+      <w:rPr>
+        <w:u w:val="none"/>
+      </w:rPr>
+    </w:lvl>
+    <w:lvl w:ilvl="7">
+      <w:start w:val="1"/>
+      <w:numFmt w:val="bullet"/>
+      <w:lvlText w:val="○"/>
+      <w:lvlJc w:val="left"/>
+      <w:pPr>
+        <w:ind w:left="5760" w:hanging="360"/>
+      </w:pPr>
+      <w:rPr>
+        <w:u w:val="none"/>
+      </w:rPr>
+    </w:lvl>
+    <w:lvl w:ilvl="8">
+      <w:start w:val="1"/>
+      <w:numFmt w:val="bullet"/>
+      <w:lvlText w:val="■"/>
+      <w:lvlJc w:val="left"/>
+      <w:pPr>
+        <w:ind w:left="6480" w:hanging="360"/>
+      </w:pPr>
+      <w:rPr>
+        <w:u w:val="none"/>
+      </w:rPr>
+    </w:lvl>
+  </w:abstractNum>
+  <w:abstractNum w:abstractNumId="19">
+    <w:lvl w:ilvl="0">
+      <w:start w:val="1"/>
+      <w:numFmt w:val="bullet"/>
+      <w:lvlText w:val="●"/>
+      <w:lvlJc w:val="left"/>
+      <w:pPr>
+        <w:ind w:left="720" w:hanging="360"/>
+      </w:pPr>
+      <w:rPr>
+        <w:u w:val="none"/>
+      </w:rPr>
+    </w:lvl>
+    <w:lvl w:ilvl="1">
+      <w:start w:val="1"/>
+      <w:numFmt w:val="bullet"/>
+      <w:lvlText w:val="○"/>
+      <w:lvlJc w:val="left"/>
+      <w:pPr>
+        <w:ind w:left="1440" w:hanging="360"/>
+      </w:pPr>
+      <w:rPr>
+        <w:u w:val="none"/>
+      </w:rPr>
+    </w:lvl>
+    <w:lvl w:ilvl="2">
+      <w:start w:val="1"/>
+      <w:numFmt w:val="bullet"/>
+      <w:lvlText w:val="■"/>
+      <w:lvlJc w:val="left"/>
+      <w:pPr>
+        <w:ind w:left="2160" w:hanging="360"/>
+      </w:pPr>
+      <w:rPr>
+        <w:u w:val="none"/>
+      </w:rPr>
+    </w:lvl>
+    <w:lvl w:ilvl="3">
+      <w:start w:val="1"/>
+      <w:numFmt w:val="bullet"/>
+      <w:lvlText w:val="●"/>
+      <w:lvlJc w:val="left"/>
+      <w:pPr>
+        <w:ind w:left="2880" w:hanging="360"/>
+      </w:pPr>
+      <w:rPr>
+        <w:u w:val="none"/>
+      </w:rPr>
+    </w:lvl>
+    <w:lvl w:ilvl="4">
+      <w:start w:val="1"/>
+      <w:numFmt w:val="bullet"/>
+      <w:lvlText w:val="○"/>
+      <w:lvlJc w:val="left"/>
+      <w:pPr>
+        <w:ind w:left="3600" w:hanging="360"/>
+      </w:pPr>
+      <w:rPr>
+        <w:u w:val="none"/>
+      </w:rPr>
+    </w:lvl>
+    <w:lvl w:ilvl="5">
+      <w:start w:val="1"/>
+      <w:numFmt w:val="bullet"/>
+      <w:lvlText w:val="■"/>
+      <w:lvlJc w:val="left"/>
+      <w:pPr>
+        <w:ind w:left="4320" w:hanging="360"/>
+      </w:pPr>
+      <w:rPr>
+        <w:u w:val="none"/>
+      </w:rPr>
+    </w:lvl>
+    <w:lvl w:ilvl="6">
+      <w:start w:val="1"/>
+      <w:numFmt w:val="bullet"/>
+      <w:lvlText w:val="●"/>
+      <w:lvlJc w:val="left"/>
+      <w:pPr>
+        <w:ind w:left="5040" w:hanging="360"/>
+      </w:pPr>
+      <w:rPr>
+        <w:u w:val="none"/>
+      </w:rPr>
+    </w:lvl>
+    <w:lvl w:ilvl="7">
+      <w:start w:val="1"/>
+      <w:numFmt w:val="bullet"/>
+      <w:lvlText w:val="○"/>
+      <w:lvlJc w:val="left"/>
+      <w:pPr>
+        <w:ind w:left="5760" w:hanging="360"/>
+      </w:pPr>
+      <w:rPr>
+        <w:u w:val="none"/>
+      </w:rPr>
+    </w:lvl>
+    <w:lvl w:ilvl="8">
+      <w:start w:val="1"/>
+      <w:numFmt w:val="bullet"/>
+      <w:lvlText w:val="■"/>
+      <w:lvlJc w:val="left"/>
+      <w:pPr>
+        <w:ind w:left="6480" w:hanging="360"/>
+      </w:pPr>
+      <w:rPr>
+        <w:u w:val="none"/>
+      </w:rPr>
+    </w:lvl>
+  </w:abstractNum>
+  <w:abstractNum w:abstractNumId="20">
+    <w:lvl w:ilvl="0">
+      <w:start w:val="1"/>
+      <w:numFmt w:val="bullet"/>
+      <w:lvlText w:val="●"/>
+      <w:lvlJc w:val="left"/>
+      <w:pPr>
+        <w:ind w:left="720" w:hanging="360"/>
+      </w:pPr>
+      <w:rPr>
+        <w:u w:val="none"/>
+      </w:rPr>
+    </w:lvl>
+    <w:lvl w:ilvl="1">
+      <w:start w:val="1"/>
+      <w:numFmt w:val="bullet"/>
+      <w:lvlText w:val="○"/>
+      <w:lvlJc w:val="left"/>
+      <w:pPr>
+        <w:ind w:left="1440" w:hanging="360"/>
+      </w:pPr>
+      <w:rPr>
+        <w:u w:val="none"/>
+      </w:rPr>
+    </w:lvl>
+    <w:lvl w:ilvl="2">
+      <w:start w:val="1"/>
+      <w:numFmt w:val="bullet"/>
+      <w:lvlText w:val="■"/>
+      <w:lvlJc w:val="left"/>
+      <w:pPr>
+        <w:ind w:left="2160" w:hanging="360"/>
+      </w:pPr>
+      <w:rPr>
+        <w:u w:val="none"/>
+      </w:rPr>
+    </w:lvl>
+    <w:lvl w:ilvl="3">
+      <w:start w:val="1"/>
+      <w:numFmt w:val="bullet"/>
+      <w:lvlText w:val="●"/>
+      <w:lvlJc w:val="left"/>
+      <w:pPr>
+        <w:ind w:left="2880" w:hanging="360"/>
+      </w:pPr>
+      <w:rPr>
+        <w:u w:val="none"/>
+      </w:rPr>
+    </w:lvl>
+    <w:lvl w:ilvl="4">
+      <w:start w:val="1"/>
+      <w:numFmt w:val="bullet"/>
+      <w:lvlText w:val="○"/>
+      <w:lvlJc w:val="left"/>
+      <w:pPr>
+        <w:ind w:left="3600" w:hanging="360"/>
+      </w:pPr>
+      <w:rPr>
+        <w:u w:val="none"/>
+      </w:rPr>
+    </w:lvl>
+    <w:lvl w:ilvl="5">
+      <w:start w:val="1"/>
+      <w:numFmt w:val="bullet"/>
+      <w:lvlText w:val="■"/>
+      <w:lvlJc w:val="left"/>
+      <w:pPr>
+        <w:ind w:left="4320" w:hanging="360"/>
+      </w:pPr>
+      <w:rPr>
+        <w:u w:val="none"/>
+      </w:rPr>
+    </w:lvl>
+    <w:lvl w:ilvl="6">
+      <w:start w:val="1"/>
+      <w:numFmt w:val="bullet"/>
+      <w:lvlText w:val="●"/>
+      <w:lvlJc w:val="left"/>
+      <w:pPr>
+        <w:ind w:left="5040" w:hanging="360"/>
+      </w:pPr>
+      <w:rPr>
+        <w:u w:val="none"/>
+      </w:rPr>
+    </w:lvl>
+    <w:lvl w:ilvl="7">
+      <w:start w:val="1"/>
+      <w:numFmt w:val="bullet"/>
+      <w:lvlText w:val="○"/>
+      <w:lvlJc w:val="left"/>
+      <w:pPr>
+        <w:ind w:left="5760" w:hanging="360"/>
+      </w:pPr>
+      <w:rPr>
+        <w:u w:val="none"/>
+      </w:rPr>
+    </w:lvl>
+    <w:lvl w:ilvl="8">
+      <w:start w:val="1"/>
+      <w:numFmt w:val="bullet"/>
+      <w:lvlText w:val="■"/>
+      <w:lvlJc w:val="left"/>
+      <w:pPr>
+        <w:ind w:left="6480" w:hanging="360"/>
+      </w:pPr>
+      <w:rPr>
+        <w:u w:val="none"/>
+      </w:rPr>
+    </w:lvl>
+  </w:abstractNum>
+  <w:abstractNum w:abstractNumId="21">
     <w:lvl w:ilvl="0">
       <w:start w:val="1"/>
       <w:numFmt w:val="bullet"/>
@@ -5688,6 +7827,18 @@
   </w:num>
   <w:num w:numId="17">
     <w:abstractNumId w:val="17"/>
+  </w:num>
+  <w:num w:numId="18">
+    <w:abstractNumId w:val="18"/>
+  </w:num>
+  <w:num w:numId="19">
+    <w:abstractNumId w:val="19"/>
+  </w:num>
+  <w:num w:numId="20">
+    <w:abstractNumId w:val="20"/>
+  </w:num>
+  <w:num w:numId="21">
+    <w:abstractNumId w:val="21"/>
   </w:num>
 </w:numbering>
 </file>

</xml_diff>